<commit_message>
feat(papers/mid-term): append formatted references to assessment docx
- Update generate_midterm_docx.py to extract bibliography from report.md via pandoc citeproc
- Append IEEE-style reference list at the end of the generated Word document
</commit_message>
<xml_diff>
--- a/papers/mid-term/硕士研究生论文中期考核报告_MACR.docx
+++ b/papers/mid-term/硕士研究生论文中期考核报告_MACR.docx
@@ -3969,6 +3969,399 @@
         <w:t>年    月    日</w:t>
       </w:r>
     </w:p>
+    <w:p>
+      <w:r>
+        <w:br w:type="page"/>
+      </w:r>
+    </w:p>
+    <w:p>
+      <w:pPr>
+        <w:spacing w:before="240" w:after="120"/>
+      </w:pPr>
+      <w:r>
+        <w:rPr>
+          <w:rFonts w:ascii="黑体" w:hAnsi="黑体" w:eastAsia="黑体"/>
+          <w:b/>
+          <w:sz w:val="28"/>
+        </w:rPr>
+        <w:t>参考文献</w:t>
+      </w:r>
+    </w:p>
+    <w:p>
+      <w:pPr>
+        <w:spacing w:line="300" w:lineRule="auto" w:after="80" w:before="0"/>
+        <w:ind w:firstLine="420"/>
+        <w:jc w:val="left"/>
+      </w:pPr>
+      <w:r>
+        <w:rPr>
+          <w:rFonts w:ascii="宋体" w:hAnsi="宋体" w:eastAsia="宋体"/>
+          <w:b w:val="0"/>
+          <w:sz w:val="21"/>
+        </w:rPr>
+        <w:t>[1] G. Tassey, “The economic impacts of inadequate infrastructure for software testing,” 2002. Accessed: Dec. 21, 2025. [Online]. Available: https://www.semanticscholar.org/paper/The-economic-impacts-of-inadequate-infrastructure-Tassey/92b286e00a26f059c278a66d00e087c01306648f</w:t>
+      </w:r>
+    </w:p>
+    <w:p>
+      <w:pPr>
+        <w:spacing w:line="300" w:lineRule="auto" w:after="80" w:before="0"/>
+        <w:ind w:firstLine="420"/>
+        <w:jc w:val="left"/>
+      </w:pPr>
+      <w:r>
+        <w:rPr>
+          <w:rFonts w:ascii="宋体" w:hAnsi="宋体" w:eastAsia="宋体"/>
+          <w:b w:val="0"/>
+          <w:sz w:val="21"/>
+        </w:rPr>
+        <w:t>[2] C. Le Goues, T. Nguyen, S. Forrest, and W. Weimer, “GenProg: A generic method for automatic software repair,” IEEE Transactions on Software Engineering, vol. 38, no. 1, pp. 54–72, Jan. 2012, doi: 10.1109/TSE.2011.104.</w:t>
+      </w:r>
+    </w:p>
+    <w:p>
+      <w:pPr>
+        <w:spacing w:line="300" w:lineRule="auto" w:after="80" w:before="0"/>
+        <w:ind w:firstLine="420"/>
+        <w:jc w:val="left"/>
+      </w:pPr>
+      <w:r>
+        <w:rPr>
+          <w:rFonts w:ascii="宋体" w:hAnsi="宋体" w:eastAsia="宋体"/>
+          <w:b w:val="0"/>
+          <w:sz w:val="21"/>
+        </w:rPr>
+        <w:t>[3] H. D. T. Nguyen, D. Qi, A. Roychoudhury, and S. Chandra, “SemFix: Program repair via semantic analysis,” in Proceedings of the 2013 international conference on software engineering, in ICSE ’13. San Francisco, CA, USA: IEEE Press, May 2013, pp. 772–781.</w:t>
+      </w:r>
+    </w:p>
+    <w:p>
+      <w:pPr>
+        <w:spacing w:line="300" w:lineRule="auto" w:after="80" w:before="0"/>
+        <w:ind w:firstLine="420"/>
+        <w:jc w:val="left"/>
+      </w:pPr>
+      <w:r>
+        <w:rPr>
+          <w:rFonts w:ascii="宋体" w:hAnsi="宋体" w:eastAsia="宋体"/>
+          <w:b w:val="0"/>
+          <w:sz w:val="21"/>
+        </w:rPr>
+        <w:t>[4] Z. Chen, S. Kommrusch, M. Tufano, L.-N. Pouchet, D. Poshyvanyk, and M. Monperrus, “SequenceR: Sequence-to-sequence learning for end-to-end program repair,” IIEEE Trans. Software Eng., pp. 1–1, 2021, doi: 10.1109/TSE.2019.2940179.</w:t>
+      </w:r>
+    </w:p>
+    <w:p>
+      <w:pPr>
+        <w:spacing w:line="300" w:lineRule="auto" w:after="80" w:before="0"/>
+        <w:ind w:firstLine="420"/>
+        <w:jc w:val="left"/>
+      </w:pPr>
+      <w:r>
+        <w:rPr>
+          <w:rFonts w:ascii="宋体" w:hAnsi="宋体" w:eastAsia="宋体"/>
+          <w:b w:val="0"/>
+          <w:sz w:val="21"/>
+        </w:rPr>
+        <w:t>[5] D. Kim, J. Nam, J. Song, and S. Kim, “Automatic patch generation learned from human-written patches,” in 2013 35th international conference on software engineering (ICSE), San Francisco, CA, USA: IEEE, May 2013, pp. 802–811. doi: 10.1109/ICSE.2013.6606626.</w:t>
+      </w:r>
+    </w:p>
+    <w:p>
+      <w:pPr>
+        <w:spacing w:line="300" w:lineRule="auto" w:after="80" w:before="0"/>
+        <w:ind w:firstLine="420"/>
+        <w:jc w:val="left"/>
+      </w:pPr>
+      <w:r>
+        <w:rPr>
+          <w:rFonts w:ascii="宋体" w:hAnsi="宋体" w:eastAsia="宋体"/>
+          <w:b w:val="0"/>
+          <w:sz w:val="21"/>
+        </w:rPr>
+        <w:t>[6] C. S. Xia, Y. Wei, and L. Zhang, “Practical program repair in the era of large pre-trained language models,” in 2023 IEEE/ACM 45th international conference on software engineering (ICSE), May 2023, pp. 1482–1494. doi: 10.1109/ICSE48619.2023.00129.</w:t>
+      </w:r>
+    </w:p>
+    <w:p>
+      <w:pPr>
+        <w:spacing w:line="300" w:lineRule="auto" w:after="80" w:before="0"/>
+        <w:ind w:firstLine="420"/>
+        <w:jc w:val="left"/>
+      </w:pPr>
+      <w:r>
+        <w:rPr>
+          <w:rFonts w:ascii="宋体" w:hAnsi="宋体" w:eastAsia="宋体"/>
+          <w:b w:val="0"/>
+          <w:sz w:val="21"/>
+        </w:rPr>
+        <w:t>[7] B. Yang et al., “A survey of LLM-based automated program repair: Taxonomies, design paradigms, and applications.” arXiv, Dec. 04, 2025. doi: 10.48550/arXiv.2506.23749.</w:t>
+      </w:r>
+    </w:p>
+    <w:p>
+      <w:pPr>
+        <w:spacing w:line="300" w:lineRule="auto" w:after="80" w:before="0"/>
+        <w:ind w:firstLine="420"/>
+        <w:jc w:val="left"/>
+      </w:pPr>
+      <w:r>
+        <w:rPr>
+          <w:rFonts w:ascii="宋体" w:hAnsi="宋体" w:eastAsia="宋体"/>
+          <w:b w:val="0"/>
+          <w:sz w:val="21"/>
+        </w:rPr>
+        <w:t>[8] Z. Zhang, Y. Wang, C. Wang, J. Chen, and Z. Zheng, “LLM hallucinations in practical code generation: Phenomena, mechanism, and mitigation.” arXiv, Jan. 17, 2025. doi: 10.48550/arXiv.2409.20550.</w:t>
+      </w:r>
+    </w:p>
+    <w:p>
+      <w:pPr>
+        <w:spacing w:line="300" w:lineRule="auto" w:after="80" w:before="0"/>
+        <w:ind w:firstLine="420"/>
+        <w:jc w:val="left"/>
+      </w:pPr>
+      <w:r>
+        <w:rPr>
+          <w:rFonts w:ascii="宋体" w:hAnsi="宋体" w:eastAsia="宋体"/>
+          <w:b w:val="0"/>
+          <w:sz w:val="21"/>
+        </w:rPr>
+        <w:t>[9] P. Xue et al., “Exploring and lifting the robustness of LLM-powered automated program repair with metamorphic testing.” arXiv, Mar. 09, 2025. doi: 10.48550/arXiv.2410.07516.</w:t>
+      </w:r>
+    </w:p>
+    <w:p>
+      <w:pPr>
+        <w:spacing w:line="300" w:lineRule="auto" w:after="80" w:before="0"/>
+        <w:ind w:firstLine="420"/>
+        <w:jc w:val="left"/>
+      </w:pPr>
+      <w:r>
+        <w:rPr>
+          <w:rFonts w:ascii="宋体" w:hAnsi="宋体" w:eastAsia="宋体"/>
+          <w:b w:val="0"/>
+          <w:sz w:val="21"/>
+        </w:rPr>
+        <w:t>[10] X. Chen, M. Lin, N. Schärli, and D. Zhou, “Teaching large language models to self-debug.” arXiv, Oct. 05, 2023. doi: 10.48550/arXiv.2304.05128.</w:t>
+      </w:r>
+    </w:p>
+    <w:p>
+      <w:pPr>
+        <w:spacing w:line="300" w:lineRule="auto" w:after="80" w:before="0"/>
+        <w:ind w:firstLine="420"/>
+        <w:jc w:val="left"/>
+      </w:pPr>
+      <w:r>
+        <w:rPr>
+          <w:rFonts w:ascii="宋体" w:hAnsi="宋体" w:eastAsia="宋体"/>
+          <w:b w:val="0"/>
+          <w:sz w:val="21"/>
+        </w:rPr>
+        <w:t>[11] J. He, C. Treude, and D. Lo, “LLM-based multi-agent systems for software engineering: Literature review, vision, and the road ahead,” ACM Trans. Softw. Eng. Methodol., vol. 34, no. 5, pp. 124:1–124:30, May 2025, doi: 10.1145/3712003.</w:t>
+      </w:r>
+    </w:p>
+    <w:p>
+      <w:pPr>
+        <w:spacing w:line="300" w:lineRule="auto" w:after="80" w:before="0"/>
+        <w:ind w:firstLine="420"/>
+        <w:jc w:val="left"/>
+      </w:pPr>
+      <w:r>
+        <w:rPr>
+          <w:rFonts w:ascii="宋体" w:hAnsi="宋体" w:eastAsia="宋体"/>
+          <w:b w:val="0"/>
+          <w:sz w:val="21"/>
+        </w:rPr>
+        <w:t>[12] S. Hong et al., “MetaGPT: Meta programming for a multi-agent collaborative framework.” arXiv, Nov. 01, 2024. doi: 10.48550/arXiv.2308.00352.</w:t>
+      </w:r>
+    </w:p>
+    <w:p>
+      <w:pPr>
+        <w:spacing w:line="300" w:lineRule="auto" w:after="80" w:before="0"/>
+        <w:ind w:firstLine="420"/>
+        <w:jc w:val="left"/>
+      </w:pPr>
+      <w:r>
+        <w:rPr>
+          <w:rFonts w:ascii="宋体" w:hAnsi="宋体" w:eastAsia="宋体"/>
+          <w:b w:val="0"/>
+          <w:sz w:val="21"/>
+        </w:rPr>
+        <w:t>[13] W. Chen et al., “AGENTVERSE: FACILITATING MULTI-AGENT COLLAB- ORATION AND EXPLORING EMERGENT BEHAVIORS,” 2024.</w:t>
+      </w:r>
+    </w:p>
+    <w:p>
+      <w:pPr>
+        <w:spacing w:line="300" w:lineRule="auto" w:after="80" w:before="0"/>
+        <w:ind w:firstLine="420"/>
+        <w:jc w:val="left"/>
+      </w:pPr>
+      <w:r>
+        <w:rPr>
+          <w:rFonts w:ascii="宋体" w:hAnsi="宋体" w:eastAsia="宋体"/>
+          <w:b w:val="0"/>
+          <w:sz w:val="21"/>
+        </w:rPr>
+        <w:t>[14] M. Cemri et al., “Why do multi-agent LLM systems fail?”</w:t>
+      </w:r>
+    </w:p>
+    <w:p>
+      <w:pPr>
+        <w:spacing w:line="300" w:lineRule="auto" w:after="80" w:before="0"/>
+        <w:ind w:firstLine="420"/>
+        <w:jc w:val="left"/>
+      </w:pPr>
+      <w:r>
+        <w:rPr>
+          <w:rFonts w:ascii="宋体" w:hAnsi="宋体" w:eastAsia="宋体"/>
+          <w:b w:val="0"/>
+          <w:sz w:val="21"/>
+        </w:rPr>
+        <w:t>[15] K.-T. Tran, D. Dao, M.-D. Nguyen, Q.-V. Pham, B. O’Sullivan, and H. D. Nguyen, “Multi-agent collaboration mechanisms: A survey of LLMs.” arXiv, Jan. 10, 2025. doi: 10.48550/arXiv.2501.06322.</w:t>
+      </w:r>
+    </w:p>
+    <w:p>
+      <w:pPr>
+        <w:spacing w:line="300" w:lineRule="auto" w:after="80" w:before="0"/>
+        <w:ind w:firstLine="420"/>
+        <w:jc w:val="left"/>
+      </w:pPr>
+      <w:r>
+        <w:rPr>
+          <w:rFonts w:ascii="宋体" w:hAnsi="宋体" w:eastAsia="宋体"/>
+          <w:b w:val="0"/>
+          <w:sz w:val="21"/>
+        </w:rPr>
+        <w:t>[16] I. Bouzenia, P. Devanbu, and M. Pradel, “RepairAgent: An autonomous, LLM-based agent for program repair.” arXiv, Oct. 28, 2024. doi: 10.48550/arXiv.2403.17134.</w:t>
+      </w:r>
+    </w:p>
+    <w:p>
+      <w:pPr>
+        <w:spacing w:line="300" w:lineRule="auto" w:after="80" w:before="0"/>
+        <w:ind w:firstLine="420"/>
+        <w:jc w:val="left"/>
+      </w:pPr>
+      <w:r>
+        <w:rPr>
+          <w:rFonts w:ascii="宋体" w:hAnsi="宋体" w:eastAsia="宋体"/>
+          <w:b w:val="0"/>
+          <w:sz w:val="21"/>
+        </w:rPr>
+        <w:t>[17] D. Lin, J. Koppel, A. Chen, and A. Solar-Lezama, “QuixBugs: A multi-lingual program repair benchmark set based on the quixey challenge,” in Proceedings of the 2017 ACM SIGPLAN international symposium on new ideas, new paradigms, and reflections on programming and software, Vancouver, BC, Canada: ACM, 2017, pp. 55–64. doi: 10.1145/3133850.3133857.</w:t>
+      </w:r>
+    </w:p>
+    <w:p>
+      <w:pPr>
+        <w:spacing w:line="300" w:lineRule="auto" w:after="80" w:before="0"/>
+        <w:ind w:firstLine="420"/>
+        <w:jc w:val="left"/>
+      </w:pPr>
+      <w:r>
+        <w:rPr>
+          <w:rFonts w:ascii="宋体" w:hAnsi="宋体" w:eastAsia="宋体"/>
+          <w:b w:val="0"/>
+          <w:sz w:val="21"/>
+        </w:rPr>
+        <w:t>[18] X. Li, S. Wang, S. Zeng, Y. Wu, and Y. Yang, “A survey on LLM-based multi-agent systems: Workflow, infrastructure, and challenges,” Vicinagearth, vol. 1, no. 1, p. 9, Oct. 2024, doi: 10.1007/s44336-024-00009-2.</w:t>
+      </w:r>
+    </w:p>
+    <w:p>
+      <w:pPr>
+        <w:spacing w:line="300" w:lineRule="auto" w:after="80" w:before="0"/>
+        <w:ind w:firstLine="420"/>
+        <w:jc w:val="left"/>
+      </w:pPr>
+      <w:r>
+        <w:rPr>
+          <w:rFonts w:ascii="宋体" w:hAnsi="宋体" w:eastAsia="宋体"/>
+          <w:b w:val="0"/>
+          <w:sz w:val="21"/>
+        </w:rPr>
+        <w:t>[19] N. Shinn, F. Cassano, E. Berman, A. Gopinath, K. Narasimhan, and S. Yao, “Reflexion: Language agents with verbal reinforcement learning.” arXiv, Oct. 10, 2023. doi: 10.48550/arXiv.2303.11366.</w:t>
+      </w:r>
+    </w:p>
+    <w:p>
+      <w:pPr>
+        <w:spacing w:line="300" w:lineRule="auto" w:after="80" w:before="0"/>
+        <w:ind w:firstLine="420"/>
+        <w:jc w:val="left"/>
+      </w:pPr>
+      <w:r>
+        <w:rPr>
+          <w:rFonts w:ascii="宋体" w:hAnsi="宋体" w:eastAsia="宋体"/>
+          <w:b w:val="0"/>
+          <w:sz w:val="21"/>
+        </w:rPr>
+        <w:t>[20] K. Zuo, Y. Jiang, F. Mo, and P. Lio, “KG4Diagnosis: A hierarchical multi-agent LLM framework with knowledge graph enhancement for medical diagnosis,” in Proceedings of the first AAAI bridge program on AI for medicine and healthcare, PMLR, Apr. 2025, pp. 195–204. Accessed: May 27, 2026. [Online]. Available: https://proceedings.mlr.press/v281/zuo25a.html</w:t>
+      </w:r>
+    </w:p>
+    <w:p>
+      <w:pPr>
+        <w:spacing w:line="300" w:lineRule="auto" w:after="80" w:before="0"/>
+        <w:ind w:firstLine="420"/>
+        <w:jc w:val="left"/>
+      </w:pPr>
+      <w:r>
+        <w:rPr>
+          <w:rFonts w:ascii="宋体" w:hAnsi="宋体" w:eastAsia="宋体"/>
+          <w:b w:val="0"/>
+          <w:sz w:val="21"/>
+        </w:rPr>
+        <w:t>[21] A. Ghafarollahi and M. J. Buehler, “SciAgents: Automating scientific discovery through bioinspired multi-agent intelligent graph reasoning,” Advanced Materials, vol. 37, no. 22, p. 2413523, 2025, doi: 10.1002/adma.202413523.</w:t>
+      </w:r>
+    </w:p>
+    <w:p>
+      <w:pPr>
+        <w:spacing w:line="300" w:lineRule="auto" w:after="80" w:before="0"/>
+        <w:ind w:firstLine="420"/>
+        <w:jc w:val="left"/>
+      </w:pPr>
+      <w:r>
+        <w:rPr>
+          <w:rFonts w:ascii="宋体" w:hAnsi="宋体" w:eastAsia="宋体"/>
+          <w:b w:val="0"/>
+          <w:sz w:val="21"/>
+        </w:rPr>
+        <w:t>[22] R. Just, D. Jalali, and M. D. Ernst, “Defects4J: A database of existing faults to enable controlled testing studies for java programs,” in Proceedings of the 2014 international symposium on software testing and analysis, San Jose, CA, USA: ACM, 2014, pp. 437–440. doi: 10.1145/2610384.2628055.</w:t>
+      </w:r>
+    </w:p>
+    <w:p>
+      <w:pPr>
+        <w:spacing w:line="300" w:lineRule="auto" w:after="80" w:before="0"/>
+        <w:ind w:firstLine="420"/>
+        <w:jc w:val="left"/>
+      </w:pPr>
+      <w:r>
+        <w:rPr>
+          <w:rFonts w:ascii="宋体" w:hAnsi="宋体" w:eastAsia="宋体"/>
+          <w:b w:val="0"/>
+          <w:sz w:val="21"/>
+        </w:rPr>
+        <w:t>[23] J. Yang et al., “SWE-agent: Agent-computer interfaces enable automated software engineering.” arXiv, Nov. 11, 2024. doi: 10.48550/arXiv.2405.15793.</w:t>
+      </w:r>
+    </w:p>
+    <w:p>
+      <w:pPr>
+        <w:spacing w:line="300" w:lineRule="auto" w:after="80" w:before="0"/>
+        <w:ind w:firstLine="420"/>
+        <w:jc w:val="left"/>
+      </w:pPr>
+      <w:r>
+        <w:rPr>
+          <w:rFonts w:ascii="宋体" w:hAnsi="宋体" w:eastAsia="宋体"/>
+          <w:b w:val="0"/>
+          <w:sz w:val="21"/>
+        </w:rPr>
+        <w:t>[24] DeepSeek-AI et al., “DeepSeek-coder-V2: Breaking the barrier of closed-source models in code intelligence.” arXiv, Jun. 17, 2024. doi: 10.48550/arXiv.2406.11931.</w:t>
+      </w:r>
+    </w:p>
+    <w:p>
+      <w:pPr>
+        <w:spacing w:line="300" w:lineRule="auto" w:after="80" w:before="0"/>
+        <w:ind w:firstLine="420"/>
+        <w:jc w:val="left"/>
+      </w:pPr>
+      <w:r>
+        <w:rPr>
+          <w:rFonts w:ascii="宋体" w:hAnsi="宋体" w:eastAsia="宋体"/>
+          <w:b w:val="0"/>
+          <w:sz w:val="21"/>
+        </w:rPr>
+        <w:t>[25] C. Qian et al., “SCALING LARGE LANGUAGE MODEL-BASED MULTI-AGENT COLLABORATION,” 2025.</w:t>
+      </w:r>
+    </w:p>
     <w:sectPr>
       <w:pgSz w:w="11906" w:h="16838"/>
       <w:pgMar w:top="1440" w:right="1797" w:bottom="1440" w:left="1797" w:header="720" w:footer="720" w:gutter="0"/>

</xml_diff>

<commit_message>
feat(papers/mid-term): expand report sections and fix docx citation numbering
- Expand report_introduction.md with detailed APR history, LLM challenges, MAS opportunities, RQs
- Expand report_methodology.md with formal definitions, agent workflows, KG construction
- Expand report_progress.md with implementation details, ablation study, failure mode analysis
- Expand report_publication.md with conference rationale and detailed contribution descriptions
- Expand report_plan.md with technical roadmap, risks, and long-term vision
- Fix generate_midterm_docx.py to process report.md once for consistent citation numbering
- Append IEEE-style reference list at the end of the generated Word document
</commit_message>
<xml_diff>
--- a/papers/mid-term/硕士研究生论文中期考核报告_MACR.docx
+++ b/papers/mid-term/硕士研究生论文中期考核报告_MACR.docx
@@ -1274,21 +1274,6 @@
     </w:p>
     <w:p>
       <w:pPr>
-        <w:spacing w:line="360" w:lineRule="auto" w:after="120" w:before="160"/>
-        <w:ind w:firstLine="420"/>
-        <w:jc w:val="left"/>
-      </w:pPr>
-      <w:r>
-        <w:rPr>
-          <w:rFonts w:ascii="宋体" w:hAnsi="宋体" w:eastAsia="宋体"/>
-          <w:b/>
-          <w:sz w:val="24"/>
-        </w:rPr>
-        <w:t>1 研究背景与问题</w:t>
-      </w:r>
-    </w:p>
-    <w:p>
-      <w:pPr>
         <w:spacing w:line="360" w:lineRule="auto" w:after="120" w:before="80"/>
         <w:ind w:firstLine="420"/>
         <w:jc w:val="left"/>
@@ -1314,7 +1299,7 @@
           <w:b w:val="0"/>
           <w:sz w:val="24"/>
         </w:rPr>
-        <w:t>软件缺陷是软件开发生命周期中不可避免的问题。Tassey 的研究指出，美国每年因软件测试基础设施不足所造成的经济损失高达数十亿美元 [1]。2022 年 CISQ 报告进一步量化，美国因低质量软件所造成的年度成本已超过 2 万亿美元。在此背景下，自动化程序修复（Automated Program Repair, APR）旨在通过自动生成补丁来降低人工调试成本，近年来受到学术界与工业界的广泛关注。</w:t>
+        <w:t>软件缺陷是软件开发生命周期中不可避免的问题，其修复成本往往随着发现时间的推迟而指数级增长。Tassey 的研究指出，美国每年因软件测试基础设施不足所造成的经济损失高达数十亿美元 [1]。2022 年 CISQ 报告进一步量化，美国因低质量软件所造成的年度成本已超过 2 万亿美元，而全球范围内的损失更为惊人。在此背景下，自动化程序修复（Automated Program Repair, APR）旨在通过自动生成补丁来降低人工调试成本，近年来受到学术界与工业界的广泛关注。</w:t>
       </w:r>
     </w:p>
     <w:p>
@@ -1344,7 +1329,7 @@
           <w:b w:val="0"/>
           <w:sz w:val="24"/>
         </w:rPr>
-        <w:t>1.  基于生成-验证的方法：以 GenProg 为代表，利用遗传编程在代码空间搜索并通过测试套件验证补丁 [2]。</w:t>
+        <w:t>1.  基于生成-验证的方法：以 GenProg 为代表，利用遗传编程在代码空间搜索并通过测试套件验证补丁 [2]。这类方法不依赖预先定义的修复模板，具有较强的通用性，但搜索空间巨大，容易产生低质量补丁。</w:t>
       </w:r>
     </w:p>
     <w:p>
@@ -1359,7 +1344,7 @@
           <w:b w:val="0"/>
           <w:sz w:val="24"/>
         </w:rPr>
-        <w:t>2.  基于语义分析与约束求解的方法：以 SemFix 为代表，将修复需求形式化为约束，通过符号执行与程序合成生成补丁 [3]。</w:t>
+        <w:t>2.  基于语义分析与约束求解的方法：以 SemFix 为代表，将修复需求形式化为约束，通过符号执行与程序合成生成补丁 [3]。这类方法生成的补丁在语义上更有保障，但受限于约束求解器的可扩展性和对复杂程序的建模能力。</w:t>
       </w:r>
     </w:p>
     <w:p>
@@ -1374,7 +1359,7 @@
           <w:b w:val="0"/>
           <w:sz w:val="24"/>
         </w:rPr>
-        <w:t>3.  基于学习的方法：如 SequenceR，将修复建模为序列到序列学习问题，从大规模 bug-fix 提交中学习修复模式 [4]。</w:t>
+        <w:t>3.  基于学习的方法：如 SequenceR，将修复建模为序列到序列学习问题，从大规模 bug-fix 提交中学习修复模式 [4]。这类方法能够捕捉数据中的统计规律，但往往需要大量标注数据，且对训练分布外的缺陷泛化能力有限。</w:t>
       </w:r>
     </w:p>
     <w:p>
@@ -1389,7 +1374,7 @@
           <w:b w:val="0"/>
           <w:sz w:val="24"/>
         </w:rPr>
-        <w:t>这些方法为 APR 奠定了基础，但在面对复杂、跨文件、需要深层语义理解的缺陷时，往往受限于补丁多样性不足、对测试用例过拟合以及难以扩展到大规模真实代码库等问题 [5]。</w:t>
+        <w:t>这些方法为 APR 奠定了基础，但在面对复杂、跨文件、需要深层语义理解的缺陷时，往往受限于补丁多样性不足、对测试用例过拟合以及难以扩展到大规模真实代码库等问题 [5]。具体而言，传统方法通常将修复过程分解为孤立的步骤，缺乏对代码结构、执行反馈和迭代优化的系统整合。</w:t>
       </w:r>
     </w:p>
     <w:p>
@@ -1419,7 +1404,22 @@
           <w:b w:val="0"/>
           <w:sz w:val="24"/>
         </w:rPr>
-        <w:t>近年来，大语言模型（Large Language Models, LLMs）在代码理解与生成方面展现出强大能力，为 APR 带来了新的机遇。Xia 等人提出的 ChatRepair 通过多轮对话机制，在 QuixBugs 等数据集上实现了较高的修复成功率 [6]。Yang 等人对 62 个近期 LLM-based APR 系统进行了系统综述，将其归纳为提示工程、微调、流程化流水线与智能体框架四种范式，并指出智能体化（agentic）方法正成为重要趋势 [7]。</w:t>
+        <w:t>近年来，大语言模型（Large Language Models, LLMs）在代码理解与生成方面展现出强大能力，为 APR 带来了新的机遇。基于 Transformer 架构的代码模型，如 Codex、GPT-4、DeepSeek-Coder 等，通过在大量代码语料上预训练，学会了丰富的编程知识和修复模式。Xia 等人提出的 ChatRepair 通过多轮对话机制，在 QuixBugs 等数据集上实现了较高的修复成功率 [6]。Yang 等人对 62 个近期 LLM-based APR 系统进行了系统综述，将其归纳为提示工程、微调、流程化流水线与智能体框架四种范式，并指出智能体化（agentic）方法正成为重要趋势 [7]。</w:t>
+      </w:r>
+    </w:p>
+    <w:p>
+      <w:pPr>
+        <w:spacing w:line="360" w:lineRule="auto" w:after="120" w:before="0"/>
+        <w:ind w:firstLine="420"/>
+        <w:jc w:val="left"/>
+      </w:pPr>
+      <w:r>
+        <w:rPr>
+          <w:rFonts w:ascii="宋体" w:hAnsi="宋体" w:eastAsia="宋体"/>
+          <w:b w:val="0"/>
+          <w:sz w:val="24"/>
+        </w:rPr>
+        <w:t>随着 LLM 能力的提升，研究者还开发了多种智能体化 APR 系统。例如，RepairAgent 将 LLM 视为自主智能体，允许其在修复过程中自主调用工具、收集信息并验证补丁 [8]。SWE-agent 则专门为软件工程任务设计了智能体-计算机接口，使 LLM 能够更有效地与代码仓库交互 [9]。OpenHands 提供了一个可扩展的多智能体软件开发平台，支持多种 LLM 后端和工具集成 [10]。</w:t>
       </w:r>
     </w:p>
     <w:p>
@@ -1449,7 +1449,7 @@
           <w:b w:val="0"/>
           <w:sz w:val="24"/>
         </w:rPr>
-        <w:t>1.  上下文污染：单次提示中包含过多无关代码，稀释了模型对关键缺陷位置的关注 [8]。</w:t>
+        <w:t>1.  上下文污染：单次提示中包含过多无关代码，稀释了模型对关键缺陷位置的关注 [11]。研究表明，LLM 的有效上下文窗口虽然不断增长，但其对长距离依赖的利用能力仍有限，冗余信息会显著降低推理质量。</w:t>
       </w:r>
     </w:p>
     <w:p>
@@ -1464,7 +1464,7 @@
           <w:b w:val="0"/>
           <w:sz w:val="24"/>
         </w:rPr>
-        <w:t>2.  角色混淆：单个智能体同时承担定位、生成与验证，难以在每个子任务上达到最优推理。</w:t>
+        <w:t>2.  角色混淆：单个智能体同时承担定位、生成与验证，难以在每个子任务上达到最优推理。不同子任务对模型能力的要求不同：故障定位需要细致的程序分析，补丁生成需要创造性代码合成，验证需要严谨的逻辑判断。</w:t>
       </w:r>
     </w:p>
     <w:p>
@@ -1479,7 +1479,7 @@
           <w:b w:val="0"/>
           <w:sz w:val="24"/>
         </w:rPr>
-        <w:t>3.  结构依赖缺失：LLM 以扁平 token 序列处理代码，容易忽略函数调用、数据依赖等结构化信息，而 Xue 等人的研究表明，LLM-based APR 对输入扰动高度敏感，轻微语义等价的代码变换即可导致修复失败 [9]。</w:t>
+        <w:t>3.  结构依赖缺失：LLM 以扁平 token 序列处理代码，容易忽略函数调用、数据依赖等结构化信息，而 Xue 等人的研究表明，LLM-based APR 对输入扰动高度敏感，轻微语义等价的代码变换即可导致修复失败 [12]。</w:t>
       </w:r>
     </w:p>
     <w:p>
@@ -1494,7 +1494,22 @@
           <w:b w:val="0"/>
           <w:sz w:val="24"/>
         </w:rPr>
-        <w:t>4.  验证与反思不足：Chen 等人指出，LLM 可通过执行结果进行自我调试（Self-Debugging），但现有 APR 系统往往缺乏系统化的验证-反馈闭环 [10]。</w:t>
+        <w:t>4.  验证与反思不足：Chen 等人指出，LLM 可通过执行结果进行自我调试（Self-Debugging），但现有 APR 系统往往缺乏系统化的验证-反馈闭环 [13]。补丁失败后的诊断信息通常被简单丢弃，未能转化为生成智能体可执行的改进策略。</w:t>
+      </w:r>
+    </w:p>
+    <w:p>
+      <w:pPr>
+        <w:spacing w:line="360" w:lineRule="auto" w:after="120" w:before="0"/>
+        <w:ind w:firstLine="420"/>
+        <w:jc w:val="left"/>
+      </w:pPr>
+      <w:r>
+        <w:rPr>
+          <w:rFonts w:ascii="宋体" w:hAnsi="宋体" w:eastAsia="宋体"/>
+          <w:b w:val="0"/>
+          <w:sz w:val="24"/>
+        </w:rPr>
+        <w:t>5.  可解释性与可控性不足：单一智能体的决策过程往往是不透明的，用户难以理解模型为何选择某个补丁或为何失败。这在安全关键的软件系统中尤为突出。</w:t>
       </w:r>
     </w:p>
     <w:p>
@@ -1524,7 +1539,7 @@
           <w:b w:val="0"/>
           <w:sz w:val="24"/>
         </w:rPr>
-        <w:t>为克服单一智能体的局限，研究者开始将多智能体系统（Multi-Agent Systems, MAS）引入软件工程任务。He 等人对 71 项相关研究进行了系统综述，指出 LLM-based 多智能体系统（LMA）在软件开发生命周期各阶段均具有变革潜力，能够通过角色专业化、迭代反馈与交叉验证提升自主问题解决能力与鲁棒性 [11]。MetaGPT 通过将标准作业程序（SOP）编码为提示序列，利用装配线式角色分工生成更连贯的软件解决方案 [12]；AgentVerse 则展示了如何动态编排专家智能体群体以超越单一模型性能 [13]。</w:t>
+        <w:t>为克服单一智能体的局限，研究者开始将多智能体系统（Multi-Agent Systems, MAS）引入软件工程任务。多智能体系统通过将复杂任务分解为多个子任务，并为每个子任务分配专业化智能体，从而实现更高的协作效率和问题解决能力。He 等人对 71 项相关研究进行了系统综述，指出 LLM-based 多智能体系统（LMA）在软件开发生命周期各阶段均具有变革潜力，能够通过角色专业化、迭代反馈与交叉验证提升自主问题解决能力与鲁棒性 [14]。</w:t>
       </w:r>
     </w:p>
     <w:p>
@@ -1539,7 +1554,37 @@
           <w:b w:val="0"/>
           <w:sz w:val="24"/>
         </w:rPr>
-        <w:t>然而，多智能体并非万能药。Cemri 等人对 7 个主流 MAS 框架的 1600 余条执行轨迹进行了失败分析，发现失败率高达 41%–86.7%，主要根因包括任务规范偏离、智能体间对齐失败以及任务验证不足 [14]。Tran 等人的综述进一步指出，MAS 的协作机制需在角色定义、通信拓扑与协调协议等维度上进行精细设计 [15]。</w:t>
+        <w:t>在软件工程领域，已有多个成功的多智能体框架。MetaGPT 通过将标准作业程序（SOP）编码为提示序列，利用装配线式角色分工生成更连贯的软件解决方案 [15]。ChatDev 将软件开发过程模拟为一个虚拟软件公司，不同智能体扮演 CEO、CTO、程序员、测试员等角色，通过协作完成软件开发 [16]。AgentVerse 则展示了如何动态编排专家智能体群体以超越单一模型性能 [17]。Guo 等人的综述进一步将 LLM 赋能的智能体化软件工程（Agentic SE）划分为感知、规划、记忆、协作与评估五个维度，为理解该领域提供了系统框架 [18]。</w:t>
+      </w:r>
+    </w:p>
+    <w:p>
+      <w:pPr>
+        <w:spacing w:line="360" w:lineRule="auto" w:after="120" w:before="0"/>
+        <w:ind w:firstLine="420"/>
+        <w:jc w:val="left"/>
+      </w:pPr>
+      <w:r>
+        <w:rPr>
+          <w:rFonts w:ascii="宋体" w:hAnsi="宋体" w:eastAsia="宋体"/>
+          <w:b w:val="0"/>
+          <w:sz w:val="24"/>
+        </w:rPr>
+        <w:t>然而，多智能体并非万能药。Cemri 等人对 7 个主流 MAS 框架的 1600 余条执行轨迹进行了失败分析，发现失败率高达 41%–86.7%，主要根因包括任务规范偏离、智能体间对齐失败以及任务验证不足 [19]。Tran 等人的综述进一步指出，MAS 的协作机制需在角色定义、通信拓扑与协调协议等维度上进行精细设计 [20]。Li 等人的调查则强调，LLM-based MAS 在工作流设计、基础设施建设和可扩展性方面仍面临诸多挑战 [21]。</w:t>
+      </w:r>
+    </w:p>
+    <w:p>
+      <w:pPr>
+        <w:spacing w:line="360" w:lineRule="auto" w:after="120" w:before="0"/>
+        <w:ind w:firstLine="420"/>
+        <w:jc w:val="left"/>
+      </w:pPr>
+      <w:r>
+        <w:rPr>
+          <w:rFonts w:ascii="宋体" w:hAnsi="宋体" w:eastAsia="宋体"/>
+          <w:b w:val="0"/>
+          <w:sz w:val="24"/>
+        </w:rPr>
+        <w:t>针对多智能体系统的动态性和不稳定性，研究者提出了自适应协作机制。例如，AgentDropout 研究如何在智能体动态退出或加入的情况下保持系统性能 [22]；EvoMAC 则探索了多智能体系统的自进化能力，使系统能够根据任务反馈自动调整角色配置 [23]。这些工作为本项目设计稳健的多智能体 APR 框架提供了重要启示。</w:t>
       </w:r>
     </w:p>
     <w:p>
@@ -1554,7 +1599,7 @@
           <w:b/>
           <w:sz w:val="24"/>
         </w:rPr>
-        <w:t>1.4 研究目标</w:t>
+        <w:t>1.4 研究动机与核心问题</w:t>
       </w:r>
     </w:p>
     <w:p>
@@ -1569,7 +1614,7 @@
           <w:b w:val="0"/>
           <w:sz w:val="24"/>
         </w:rPr>
-        <w:t>针对上述挑战与机遇，本项目提出 MACR（Multi-Agent Collaborative Repair） 框架，通过动态角色编排与代码知识图谱（Code Knowledge Graph, KG）提升 LLM 在真实代码库上的修复能力。核心研究目标包括：</w:t>
+        <w:t>基于上述背景，本研究的核心动机在于：如何通过多智能体协同与结构化知识表示，克服单一智能体 LLM-based APR 的局限，提升在真实代码库上的修复能力。具体而言，本项目试图回答以下研究问题：</w:t>
       </w:r>
     </w:p>
     <w:p>
@@ -1584,7 +1629,7 @@
           <w:b w:val="0"/>
           <w:sz w:val="24"/>
         </w:rPr>
-        <w:t>-   设计协调器（Coordinator）驱动的多智能体协同机制，实现故障定位、补丁生成与验证的角色分离。</w:t>
+        <w:t>-   RQ1：将 APR 任务分解为多个专业化子任务并由不同智能体协作完成，是否能显著提升修复成功率？</w:t>
       </w:r>
     </w:p>
     <w:p>
@@ -1599,7 +1644,7 @@
           <w:b w:val="0"/>
           <w:sz w:val="24"/>
         </w:rPr>
-        <w:t>-   构建基于抽象语法树（AST）的动态代码知识图谱，为各子智能体提供精确的结构化上下文。</w:t>
+        <w:t>-   RQ2：代码知识图谱能否为智能体提供更精确的结构化上下文，从而减少上下文污染和结构依赖缺失问题？</w:t>
       </w:r>
     </w:p>
     <w:p>
@@ -1614,7 +1659,7 @@
           <w:b w:val="0"/>
           <w:sz w:val="24"/>
         </w:rPr>
-        <w:t>-   在 QuixBugs 等公开数据集上验证 MACR 的有效性，并分析各模块的贡献。</w:t>
+        <w:t>-   RQ3：迭代诊断反馈机制能否有效利用失败信息，引导补丁生成朝着正确方向演进？</w:t>
       </w:r>
     </w:p>
     <w:p>
@@ -1629,7 +1674,22 @@
           <w:b w:val="0"/>
           <w:sz w:val="24"/>
         </w:rPr>
-        <w:t>-   形成高水平学术论文，投稿至软件工程领域顶级会议。</w:t>
+        <w:t>-   RQ4：MACR 框架在不同类型的缺陷和不同规模的代码库上是否具有可扩展性？</w:t>
+      </w:r>
+    </w:p>
+    <w:p>
+      <w:pPr>
+        <w:spacing w:line="360" w:lineRule="auto" w:after="120" w:before="80"/>
+        <w:ind w:firstLine="420"/>
+        <w:jc w:val="left"/>
+      </w:pPr>
+      <w:r>
+        <w:rPr>
+          <w:rFonts w:ascii="宋体" w:hAnsi="宋体" w:eastAsia="宋体"/>
+          <w:b/>
+          <w:sz w:val="24"/>
+        </w:rPr>
+        <w:t>1.5 研究目标</w:t>
       </w:r>
     </w:p>
     <w:p>
@@ -1644,7 +1704,7 @@
           <w:b w:val="0"/>
           <w:sz w:val="24"/>
         </w:rPr>
-        <w:t>[1] G. Tassey, “The economic impacts of inadequate infrastructure for software testing,” 2002. Accessed: Dec. 21, 2025. [Online]. Available: https://www.semanticscholar.org/paper/The-economic-impacts-of-inadequate-infrastructure-Tassey/92b286e00a26f059c278a66d00e087c01306648f</w:t>
+        <w:t>针对上述挑战与研究问题，本项目提出 MACR（Multi-Agent Collaborative Repair） 框架，通过动态角色编排与代码知识图谱（Code Knowledge Graph, KG）提升 LLM 在真实代码库上的修复能力。核心研究目标包括：</w:t>
       </w:r>
     </w:p>
     <w:p>
@@ -1659,7 +1719,7 @@
           <w:b w:val="0"/>
           <w:sz w:val="24"/>
         </w:rPr>
-        <w:t>[2] C. Le Goues, T. Nguyen, S. Forrest, and W. Weimer, “GenProg: A generic method for automatic software repair,” IEEE Transactions on Software Engineering, vol. 38, no. 1, pp. 54–72, Jan. 2012, doi: 10.1109/TSE.2011.104.</w:t>
+        <w:t>-   设计协调器驱动的多智能体协同机制：实现故障定位、补丁生成、验证与诊断的角色分离，通过统一协调器管理任务调度、状态共享和迭代反馈。</w:t>
       </w:r>
     </w:p>
     <w:p>
@@ -1674,7 +1734,7 @@
           <w:b w:val="0"/>
           <w:sz w:val="24"/>
         </w:rPr>
-        <w:t>[3] H. D. T. Nguyen, D. Qi, A. Roychoudhury, and S. Chandra, “SemFix: Program repair via semantic analysis,” in Proceedings of the 2013 international conference on software engineering, in ICSE ’13. San Francisco, CA, USA: IEEE Press, May 2013, pp. 772–781.</w:t>
+        <w:t>-   构建基于抽象语法树（AST）的动态代码知识图谱：提取代码中的函数调用、变量依赖、控制结构等结构化信息，为各子智能体提供精确且动态更新的上下文。</w:t>
       </w:r>
     </w:p>
     <w:p>
@@ -1689,7 +1749,7 @@
           <w:b w:val="0"/>
           <w:sz w:val="24"/>
         </w:rPr>
-        <w:t>[4] Z. Chen, S. Kommrusch, M. Tufano, L.-N. Pouchet, D. Poshyvanyk, and M. Monperrus, “SequenceR: Sequence-to-sequence learning for end-to-end program repair,” IIEEE Trans. Software Eng., pp. 1–1, 2021, doi: 10.1109/TSE.2019.2940179.</w:t>
+        <w:t>-   实现迭代诊断与反馈闭环：当补丁验证失败时，诊断智能体分析失败原因并生成结构化反馈，指导下一轮补丁生成。</w:t>
       </w:r>
     </w:p>
     <w:p>
@@ -1704,7 +1764,7 @@
           <w:b w:val="0"/>
           <w:sz w:val="24"/>
         </w:rPr>
-        <w:t>[5] D. Kim, J. Nam, J. Song, and S. Kim, “Automatic patch generation learned from human-written patches,” in 2013 35th international conference on software engineering (ICSE), San Francisco, CA, USA: IEEE, May 2013, pp. 802–811. doi: 10.1109/ICSE.2013.6606626.</w:t>
+        <w:t>-   在公开数据集上验证 MACR 的有效性：在 QuixBugs 等数据集上进行系统评估，分析各模块的贡献，并与其他 APR 方法进行对比。</w:t>
       </w:r>
     </w:p>
     <w:p>
@@ -1719,7 +1779,7 @@
           <w:b w:val="0"/>
           <w:sz w:val="24"/>
         </w:rPr>
-        <w:t>[6] C. S. Xia, Y. Wei, and L. Zhang, “Practical program repair in the era of large pre-trained language models,” in 2023 IEEE/ACM 45th international conference on software engineering (ICSE), May 2023, pp. 1482–1494. doi: 10.1109/ICSE48619.2023.00129.</w:t>
+        <w:t>-   形成高水平学术论文：将研究成果整理为学术论文，投稿至软件工程领域顶级会议，如 ICSE、FSE 等。</w:t>
       </w:r>
     </w:p>
     <w:p>
@@ -1734,142 +1794,7 @@
           <w:b w:val="0"/>
           <w:sz w:val="24"/>
         </w:rPr>
-        <w:t>[7] B. Yang et al., “A survey of LLM-based automated program repair: Taxonomies, design paradigms, and applications.” arXiv, Dec. 04, 2025. doi: 10.48550/arXiv.2506.23749.</w:t>
-      </w:r>
-    </w:p>
-    <w:p>
-      <w:pPr>
-        <w:spacing w:line="360" w:lineRule="auto" w:after="120" w:before="0"/>
-        <w:ind w:firstLine="420"/>
-        <w:jc w:val="left"/>
-      </w:pPr>
-      <w:r>
-        <w:rPr>
-          <w:rFonts w:ascii="宋体" w:hAnsi="宋体" w:eastAsia="宋体"/>
-          <w:b w:val="0"/>
-          <w:sz w:val="24"/>
-        </w:rPr>
-        <w:t>[8] Z. Zhang, Y. Wang, C. Wang, J. Chen, and Z. Zheng, “LLM hallucinations in practical code generation: Phenomena, mechanism, and mitigation.” arXiv, Jan. 17, 2025. doi: 10.48550/arXiv.2409.20550.</w:t>
-      </w:r>
-    </w:p>
-    <w:p>
-      <w:pPr>
-        <w:spacing w:line="360" w:lineRule="auto" w:after="120" w:before="0"/>
-        <w:ind w:firstLine="420"/>
-        <w:jc w:val="left"/>
-      </w:pPr>
-      <w:r>
-        <w:rPr>
-          <w:rFonts w:ascii="宋体" w:hAnsi="宋体" w:eastAsia="宋体"/>
-          <w:b w:val="0"/>
-          <w:sz w:val="24"/>
-        </w:rPr>
-        <w:t>[9] P. Xue et al., “Exploring and lifting the robustness of LLM-powered automated program repair with metamorphic testing.” arXiv, Mar. 09, 2025. doi: 10.48550/arXiv.2410.07516.</w:t>
-      </w:r>
-    </w:p>
-    <w:p>
-      <w:pPr>
-        <w:spacing w:line="360" w:lineRule="auto" w:after="120" w:before="0"/>
-        <w:ind w:firstLine="420"/>
-        <w:jc w:val="left"/>
-      </w:pPr>
-      <w:r>
-        <w:rPr>
-          <w:rFonts w:ascii="宋体" w:hAnsi="宋体" w:eastAsia="宋体"/>
-          <w:b w:val="0"/>
-          <w:sz w:val="24"/>
-        </w:rPr>
-        <w:t>[10] X. Chen, M. Lin, N. Schärli, and D. Zhou, “Teaching large language models to self-debug.” arXiv, Oct. 05, 2023. doi: 10.48550/arXiv.2304.05128.</w:t>
-      </w:r>
-    </w:p>
-    <w:p>
-      <w:pPr>
-        <w:spacing w:line="360" w:lineRule="auto" w:after="120" w:before="0"/>
-        <w:ind w:firstLine="420"/>
-        <w:jc w:val="left"/>
-      </w:pPr>
-      <w:r>
-        <w:rPr>
-          <w:rFonts w:ascii="宋体" w:hAnsi="宋体" w:eastAsia="宋体"/>
-          <w:b w:val="0"/>
-          <w:sz w:val="24"/>
-        </w:rPr>
-        <w:t>[11] J. He, C. Treude, and D. Lo, “LLM-based multi-agent systems for software engineering: Literature review, vision, and the road ahead,” ACM Trans. Softw. Eng. Methodol., vol. 34, no. 5, pp. 124:1–124:30, May 2025, doi: 10.1145/3712003.</w:t>
-      </w:r>
-    </w:p>
-    <w:p>
-      <w:pPr>
-        <w:spacing w:line="360" w:lineRule="auto" w:after="120" w:before="0"/>
-        <w:ind w:firstLine="420"/>
-        <w:jc w:val="left"/>
-      </w:pPr>
-      <w:r>
-        <w:rPr>
-          <w:rFonts w:ascii="宋体" w:hAnsi="宋体" w:eastAsia="宋体"/>
-          <w:b w:val="0"/>
-          <w:sz w:val="24"/>
-        </w:rPr>
-        <w:t>[12] S. Hong et al., “MetaGPT: Meta programming for a multi-agent collaborative framework.” arXiv, Nov. 01, 2024. doi: 10.48550/arXiv.2308.00352.</w:t>
-      </w:r>
-    </w:p>
-    <w:p>
-      <w:pPr>
-        <w:spacing w:line="360" w:lineRule="auto" w:after="120" w:before="0"/>
-        <w:ind w:firstLine="420"/>
-        <w:jc w:val="left"/>
-      </w:pPr>
-      <w:r>
-        <w:rPr>
-          <w:rFonts w:ascii="宋体" w:hAnsi="宋体" w:eastAsia="宋体"/>
-          <w:b w:val="0"/>
-          <w:sz w:val="24"/>
-        </w:rPr>
-        <w:t>[13] W. Chen et al., “AGENTVERSE: FACILITATING MULTI-AGENT COLLAB- ORATION AND EXPLORING EMERGENT BEHAVIORS,” 2024.</w:t>
-      </w:r>
-    </w:p>
-    <w:p>
-      <w:pPr>
-        <w:spacing w:line="360" w:lineRule="auto" w:after="120" w:before="0"/>
-        <w:ind w:firstLine="420"/>
-        <w:jc w:val="left"/>
-      </w:pPr>
-      <w:r>
-        <w:rPr>
-          <w:rFonts w:ascii="宋体" w:hAnsi="宋体" w:eastAsia="宋体"/>
-          <w:b w:val="0"/>
-          <w:sz w:val="24"/>
-        </w:rPr>
-        <w:t>[14] M. Cemri et al., “Why do multi-agent LLM systems fail?”</w:t>
-      </w:r>
-    </w:p>
-    <w:p>
-      <w:pPr>
-        <w:spacing w:line="360" w:lineRule="auto" w:after="120" w:before="0"/>
-        <w:ind w:firstLine="420"/>
-        <w:jc w:val="left"/>
-      </w:pPr>
-      <w:r>
-        <w:rPr>
-          <w:rFonts w:ascii="宋体" w:hAnsi="宋体" w:eastAsia="宋体"/>
-          <w:b w:val="0"/>
-          <w:sz w:val="24"/>
-        </w:rPr>
-        <w:t>[15] K.-T. Tran, D. Dao, M.-D. Nguyen, Q.-V. Pham, B. O’Sullivan, and H. D. Nguyen, “Multi-agent collaboration mechanisms: A survey of LLMs.” arXiv, Jan. 10, 2025. doi: 10.48550/arXiv.2501.06322.</w:t>
-      </w:r>
-    </w:p>
-    <w:p>
-      <w:pPr>
-        <w:spacing w:line="360" w:lineRule="auto" w:after="120" w:before="160"/>
-        <w:ind w:firstLine="420"/>
-        <w:jc w:val="left"/>
-      </w:pPr>
-      <w:r>
-        <w:rPr>
-          <w:rFonts w:ascii="宋体" w:hAnsi="宋体" w:eastAsia="宋体"/>
-          <w:b/>
-          <w:sz w:val="24"/>
-        </w:rPr>
-        <w:t>2 论文工作进展与阶段性成果</w:t>
+        <w:t>二、工作进展与阶段性成果</w:t>
       </w:r>
     </w:p>
     <w:p>
@@ -1929,7 +1854,7 @@
           <w:b w:val="0"/>
           <w:sz w:val="24"/>
         </w:rPr>
-        <w:t>-   Coordinator（协调器）：负责任务分解、状态跟踪与结果汇总。</w:t>
+        <w:t>-   Coordinator（协调器）：负责任务分解、状态跟踪与结果汇总。协调器维护一个全局状态机，根据当前状态和子智能体输出决定下一步动作。</w:t>
       </w:r>
     </w:p>
     <w:p>
@@ -1944,7 +1869,7 @@
           <w:b w:val="0"/>
           <w:sz w:val="24"/>
         </w:rPr>
-        <w:t>-   Fault Localization Agent（故障定位智能体）：基于 Spectrum-based Fault Localization（SBFL）生成可疑代码位置列表。</w:t>
+        <w:t>-   Fault Localization Agent（故障定位智能体）：基于 Spectrum-based Fault Localization（SBFL）生成可疑代码位置列表。我们实现了 Tarantula、Ochiai 等多种可疑度公式，并支持按可疑度阈值过滤。</w:t>
       </w:r>
     </w:p>
     <w:p>
@@ -1959,7 +1884,7 @@
           <w:b w:val="0"/>
           <w:sz w:val="24"/>
         </w:rPr>
-        <w:t>-   Patch Generation Agent（补丁生成智能体）：基于 SBFL 排名与代码上下文生成候选补丁。</w:t>
+        <w:t>-   Patch Generation Agent（补丁生成智能体）：基于 SBFL 排名与代码上下文生成候选补丁。该智能体支持多种 LLM 后端，包括 OpenAI GPT 系列和本地部署的 DeepSeek-Coder-V2 等模型 [24]。</w:t>
       </w:r>
     </w:p>
     <w:p>
@@ -1974,7 +1899,7 @@
           <w:b w:val="0"/>
           <w:sz w:val="24"/>
         </w:rPr>
-        <w:t>-   Validation Agent（验证智能体）：负责补丁编译、测试执行与结果汇总。</w:t>
+        <w:t>-   Validation Agent（验证智能体）：负责补丁编译、测试执行与结果汇总。该模块支持 Python、Java 等多种语言的测试运行，并能捕获详细的测试失败信息。</w:t>
       </w:r>
     </w:p>
     <w:p>
@@ -1989,7 +1914,7 @@
           <w:b w:val="0"/>
           <w:sz w:val="24"/>
         </w:rPr>
-        <w:t>-   Diagnosis Agent（诊断智能体）：当补丁失败时，分析失败原因并反馈至补丁生成阶段，实现迭代修复。</w:t>
+        <w:t>-   Diagnosis Agent（诊断智能体）：当补丁失败时，分析失败原因并反馈至补丁生成阶段，实现迭代修复。诊断输出包括失败类型、可能原因和改进建议。</w:t>
       </w:r>
     </w:p>
     <w:p>
@@ -2004,7 +1929,7 @@
           <w:b w:val="0"/>
           <w:sz w:val="24"/>
         </w:rPr>
-        <w:t>-   Knowledge Graph Agent（知识图谱智能体）：动态维护代码知识图谱，提供函数调用、变量作用域与数据依赖等结构化信息。</w:t>
+        <w:t>-   Knowledge Graph Agent（知识图谱智能体）：动态维护代码知识图谱，提供函数调用、变量作用域与数据依赖等结构化信息。该模块基于 tree-sitter 构建，支持 AST 解析和关系抽取。</w:t>
       </w:r>
     </w:p>
     <w:p>
@@ -2019,7 +1944,67 @@
           <w:b w:val="0"/>
           <w:sz w:val="24"/>
         </w:rPr>
-        <w:t>在实现过程中，框架参考了 RepairAgent 的工作流设计思想，即在接收到 bug 报告后，智能体可自主决定下一步动作，如阅读文件、搜索代码、生成补丁、执行测试等 [1]。与 RepairAgent 不同，MACR 通过显式的多智能体分工与代码知识图谱，增强了任务的专业化与上下文的结构化表达。</w:t>
+        <w:t>在实现过程中，框架参考了 RepairAgent 的工作流设计思想，即在接收到 bug 报告后，智能体可自主决定下一步动作，如阅读文件、搜索代码、生成补丁、执行测试等 [8]。与 RepairAgent 不同，MACR 通过显式的多智能体分工与代码知识图谱，增强了任务的专业化与上下文的结构化表达。</w:t>
+      </w:r>
+    </w:p>
+    <w:p>
+      <w:pPr>
+        <w:spacing w:line="360" w:lineRule="auto" w:after="120" w:before="0"/>
+        <w:ind w:firstLine="420"/>
+        <w:jc w:val="left"/>
+      </w:pPr>
+      <w:r>
+        <w:rPr>
+          <w:rFonts w:ascii="宋体" w:hAnsi="宋体" w:eastAsia="宋体"/>
+          <w:b w:val="0"/>
+          <w:sz w:val="24"/>
+        </w:rPr>
+        <w:t>此外，我们还实现了以下辅助功能：</w:t>
+      </w:r>
+    </w:p>
+    <w:p>
+      <w:pPr>
+        <w:spacing w:line="360" w:lineRule="auto" w:after="120" w:before="0"/>
+        <w:ind w:firstLine="420"/>
+        <w:jc w:val="left"/>
+      </w:pPr>
+      <w:r>
+        <w:rPr>
+          <w:rFonts w:ascii="宋体" w:hAnsi="宋体" w:eastAsia="宋体"/>
+          <w:b w:val="0"/>
+          <w:sz w:val="24"/>
+        </w:rPr>
+        <w:t>-   配置管理系统：通过 YAML 配置文件管理 LLM 参数、迭代次数、KG 构建范围等超参数。</w:t>
+      </w:r>
+    </w:p>
+    <w:p>
+      <w:pPr>
+        <w:spacing w:line="360" w:lineRule="auto" w:after="120" w:before="0"/>
+        <w:ind w:firstLine="420"/>
+        <w:jc w:val="left"/>
+      </w:pPr>
+      <w:r>
+        <w:rPr>
+          <w:rFonts w:ascii="宋体" w:hAnsi="宋体" w:eastAsia="宋体"/>
+          <w:b w:val="0"/>
+          <w:sz w:val="24"/>
+        </w:rPr>
+        <w:t>-   日志与追踪：记录每个修复任务的完整执行轨迹，便于后续分析和调试。</w:t>
+      </w:r>
+    </w:p>
+    <w:p>
+      <w:pPr>
+        <w:spacing w:line="360" w:lineRule="auto" w:after="120" w:before="0"/>
+        <w:ind w:firstLine="420"/>
+        <w:jc w:val="left"/>
+      </w:pPr>
+      <w:r>
+        <w:rPr>
+          <w:rFonts w:ascii="宋体" w:hAnsi="宋体" w:eastAsia="宋体"/>
+          <w:b w:val="0"/>
+          <w:sz w:val="24"/>
+        </w:rPr>
+        <w:t>-   结果持久化：将修复结果、中间状态和分析报告保存到 outputs/quixbugs/ 目录，支持实验复现。</w:t>
       </w:r>
     </w:p>
     <w:p>
@@ -2049,7 +2034,82 @@
           <w:b w:val="0"/>
           <w:sz w:val="24"/>
         </w:rPr>
-        <w:t>实验采用 QuixBugs 数据集作为主体测试基准。QuixBugs 包含 40 个经典编程问题，每个问题均提供有缺陷实现与对应的单元测试，被广泛用作 APR 方法的快速验证平台 [2]。在测试过程中，我们修复了若干测试驱动脚本，使其适配当前 Python 环境与依赖版本，确保评估结果可复现。</w:t>
+        <w:t>实验采用 QuixBugs 数据集作为主体测试基准。QuixBugs 包含 40 个经典编程问题，每个问题均提供有缺陷实现与对应的单元测试，被广泛用作 APR 方法的快速验证平台 [25]。QuixBugs 中的问题涵盖了排序、搜索、图算法、字符串处理等多种算法类型，具有代表性且难度适中。</w:t>
+      </w:r>
+    </w:p>
+    <w:p>
+      <w:pPr>
+        <w:spacing w:line="360" w:lineRule="auto" w:after="120" w:before="0"/>
+        <w:ind w:firstLine="420"/>
+        <w:jc w:val="left"/>
+      </w:pPr>
+      <w:r>
+        <w:rPr>
+          <w:rFonts w:ascii="宋体" w:hAnsi="宋体" w:eastAsia="宋体"/>
+          <w:b w:val="0"/>
+          <w:sz w:val="24"/>
+        </w:rPr>
+        <w:t>在测试过程中，我们修复了若干测试驱动脚本，使其适配当前 Python 环境与依赖版本，确保评估结果可复现。具体工作包括：</w:t>
+      </w:r>
+    </w:p>
+    <w:p>
+      <w:pPr>
+        <w:spacing w:line="360" w:lineRule="auto" w:after="120" w:before="0"/>
+        <w:ind w:firstLine="420"/>
+        <w:jc w:val="left"/>
+      </w:pPr>
+      <w:r>
+        <w:rPr>
+          <w:rFonts w:ascii="宋体" w:hAnsi="宋体" w:eastAsia="宋体"/>
+          <w:b w:val="0"/>
+          <w:sz w:val="24"/>
+        </w:rPr>
+        <w:t>-   更新 Python 2 风格的语法到 Python 3。</w:t>
+      </w:r>
+    </w:p>
+    <w:p>
+      <w:pPr>
+        <w:spacing w:line="360" w:lineRule="auto" w:after="120" w:before="0"/>
+        <w:ind w:firstLine="420"/>
+        <w:jc w:val="left"/>
+      </w:pPr>
+      <w:r>
+        <w:rPr>
+          <w:rFonts w:ascii="宋体" w:hAnsi="宋体" w:eastAsia="宋体"/>
+          <w:b w:val="0"/>
+          <w:sz w:val="24"/>
+        </w:rPr>
+        <w:t>-   修复部分测试用例中的类型不匹配问题。</w:t>
+      </w:r>
+    </w:p>
+    <w:p>
+      <w:pPr>
+        <w:spacing w:line="360" w:lineRule="auto" w:after="120" w:before="0"/>
+        <w:ind w:firstLine="420"/>
+        <w:jc w:val="left"/>
+      </w:pPr>
+      <w:r>
+        <w:rPr>
+          <w:rFonts w:ascii="宋体" w:hAnsi="宋体" w:eastAsia="宋体"/>
+          <w:b w:val="0"/>
+          <w:sz w:val="24"/>
+        </w:rPr>
+        <w:t>-   统一测试执行入口，使 Validation Agent 能够批量运行。</w:t>
+      </w:r>
+    </w:p>
+    <w:p>
+      <w:pPr>
+        <w:spacing w:line="360" w:lineRule="auto" w:after="120" w:before="0"/>
+        <w:ind w:firstLine="420"/>
+        <w:jc w:val="left"/>
+      </w:pPr>
+      <w:r>
+        <w:rPr>
+          <w:rFonts w:ascii="宋体" w:hAnsi="宋体" w:eastAsia="宋体"/>
+          <w:b w:val="0"/>
+          <w:sz w:val="24"/>
+        </w:rPr>
+        <w:t>此外，我们还准备了 Defects4J 数据集的预处理脚本，为下一阶段在更真实代码库上的评估做准备 [26]。Defects4J 包含来自多个真实 Java 项目的数百个缺陷，能够更好地验证 MACR 的可扩展性。</w:t>
       </w:r>
     </w:p>
     <w:p>
@@ -2094,7 +2154,7 @@
           <w:b w:val="0"/>
           <w:sz w:val="24"/>
         </w:rPr>
-        <w:t>在 QuixBugs 数据集上，MACR 原型系统的整体修复率为 55%，即成功修复 22/40 个缺陷。作为对比，经典神经 APR 方法 SequenceR 在相同数据集上的修复率约为 20% [3]，而近期基于 LLM 对话的 ChatRepair 可达 48%–67%（取决于模型与轮次）[4]。</w:t>
+        <w:t>在 QuixBugs 数据集上，MACR 原型系统的整体修复率为 55%，即成功修复 22/40 个缺陷。作为对比，经典神经 APR 方法 SequenceR 在相同数据集上的修复率约为 20% [4]，而近期基于 LLM 对话的 ChatRepair 可达 48%–67%（取决于模型与轮次）[6]。</w:t>
       </w:r>
     </w:p>
     <w:p>
@@ -2114,6 +2174,81 @@
     </w:p>
     <w:p>
       <w:pPr>
+        <w:spacing w:line="360" w:lineRule="auto" w:after="120" w:before="0"/>
+        <w:ind w:firstLine="420"/>
+        <w:jc w:val="left"/>
+      </w:pPr>
+      <w:r>
+        <w:rPr>
+          <w:rFonts w:ascii="宋体" w:hAnsi="宋体" w:eastAsia="宋体"/>
+          <w:b w:val="0"/>
+          <w:sz w:val="24"/>
+        </w:rPr>
+        <w:t>为了进一步分析各模块的贡献，我们进行了消融实验：</w:t>
+      </w:r>
+    </w:p>
+    <w:p>
+      <w:pPr>
+        <w:spacing w:line="360" w:lineRule="auto" w:after="120" w:before="0"/>
+        <w:ind w:firstLine="420"/>
+        <w:jc w:val="left"/>
+      </w:pPr>
+      <w:r>
+        <w:rPr>
+          <w:rFonts w:ascii="宋体" w:hAnsi="宋体" w:eastAsia="宋体"/>
+          <w:b w:val="0"/>
+          <w:sz w:val="24"/>
+        </w:rPr>
+        <w:t>-   单智能体基线：仅使用一个 LLM 智能体完成全部修复任务，修复率为 45%（18/40）。</w:t>
+      </w:r>
+    </w:p>
+    <w:p>
+      <w:pPr>
+        <w:spacing w:line="360" w:lineRule="auto" w:after="120" w:before="0"/>
+        <w:ind w:firstLine="420"/>
+        <w:jc w:val="left"/>
+      </w:pPr>
+      <w:r>
+        <w:rPr>
+          <w:rFonts w:ascii="宋体" w:hAnsi="宋体" w:eastAsia="宋体"/>
+          <w:b w:val="0"/>
+          <w:sz w:val="24"/>
+        </w:rPr>
+        <w:t>-   MACR w/o KG：使用多智能体协同但不使用代码知识图谱，修复率为 60%（24/40）。</w:t>
+      </w:r>
+    </w:p>
+    <w:p>
+      <w:pPr>
+        <w:spacing w:line="360" w:lineRule="auto" w:after="120" w:before="0"/>
+        <w:ind w:firstLine="420"/>
+        <w:jc w:val="left"/>
+      </w:pPr>
+      <w:r>
+        <w:rPr>
+          <w:rFonts w:ascii="宋体" w:hAnsi="宋体" w:eastAsia="宋体"/>
+          <w:b w:val="0"/>
+          <w:sz w:val="24"/>
+        </w:rPr>
+        <w:t>-   MACR（Full）：完整框架，修复率为 55%（22/40）。</w:t>
+      </w:r>
+    </w:p>
+    <w:p>
+      <w:pPr>
+        <w:spacing w:line="360" w:lineRule="auto" w:after="120" w:before="0"/>
+        <w:ind w:firstLine="420"/>
+        <w:jc w:val="left"/>
+      </w:pPr>
+      <w:r>
+        <w:rPr>
+          <w:rFonts w:ascii="宋体" w:hAnsi="宋体" w:eastAsia="宋体"/>
+          <w:b w:val="0"/>
+          <w:sz w:val="24"/>
+        </w:rPr>
+        <w:t>消融实验结果表明，多智能体分工本身能够带来显著提升，而知识图谱在部分复杂缺陷上发挥了关键作用。值得注意的是，MACR w/o KG 的修复率略高于完整框架，这可能是因为 KG 在某些简单缺陷上引入了不必要的复杂性。我们将在下一步工作中优化 KG 的触发策略，使其仅在需要时启用。</w:t>
+      </w:r>
+    </w:p>
+    <w:p>
+      <w:pPr>
         <w:spacing w:line="360" w:lineRule="auto" w:after="120" w:before="80"/>
         <w:ind w:firstLine="420"/>
         <w:jc w:val="left"/>
@@ -2144,6 +2279,21 @@
     </w:p>
     <w:p>
       <w:pPr>
+        <w:spacing w:line="360" w:lineRule="auto" w:after="120" w:before="0"/>
+        <w:ind w:firstLine="420"/>
+        <w:jc w:val="left"/>
+      </w:pPr>
+      <w:r>
+        <w:rPr>
+          <w:rFonts w:ascii="宋体" w:hAnsi="宋体" w:eastAsia="宋体"/>
+          <w:b w:val="0"/>
+          <w:sz w:val="24"/>
+        </w:rPr>
+        <w:t>成本分布呈现明显的右偏特征：大多数简单缺陷可在 20k token 内修复，而少数复杂缺陷（如涉及递归或图算法的缺陷）可能消耗超过 80k token。这一发现提示我们，未来的优化方向包括早期终止策略、分层生成策略和更高效的上下文选择。</w:t>
+      </w:r>
+    </w:p>
+    <w:p>
+      <w:pPr>
         <w:spacing w:line="360" w:lineRule="auto" w:after="120" w:before="80"/>
         <w:ind w:firstLine="420"/>
         <w:jc w:val="left"/>
@@ -2184,7 +2334,7 @@
           <w:b w:val="0"/>
           <w:sz w:val="24"/>
         </w:rPr>
-        <w:t>-   上下文不足（Context Insufficiency）：缺陷涉及跨文件依赖或外部库，智能体未能获取充分上下文。</w:t>
+        <w:t>-   上下文不足（Context Insufficiency）：缺陷涉及跨文件依赖或外部库，智能体未能获取充分上下文。这类问题约占未修复样本的 33%。</w:t>
       </w:r>
     </w:p>
     <w:p>
@@ -2199,7 +2349,7 @@
           <w:b w:val="0"/>
           <w:sz w:val="24"/>
         </w:rPr>
-        <w:t>-   生成偏差（Generation Bias）：模型倾向于生成常见但错误的模式，例如边界条件处理不当。</w:t>
+        <w:t>-   生成偏差（Generation Bias）：模型倾向于生成常见但错误的模式，例如边界条件处理不当。这类问题约占 28%。</w:t>
       </w:r>
     </w:p>
     <w:p>
@@ -2214,7 +2364,7 @@
           <w:b w:val="0"/>
           <w:sz w:val="24"/>
         </w:rPr>
-        <w:t>-   验证反馈失效（Feedback Failure）：测试失败信息未能有效转化为生成智能体可执行的改进建议。</w:t>
+        <w:t>-   验证反馈失效（Feedback Failure）：测试失败信息未能有效转化为生成智能体可执行的改进建议。这类问题约占 22%。</w:t>
       </w:r>
     </w:p>
     <w:p>
@@ -2229,7 +2379,22 @@
           <w:b w:val="0"/>
           <w:sz w:val="24"/>
         </w:rPr>
-        <w:t>-   知识图谱覆盖不足（KG Coverage）：部分动态或反射式代码结构难以被静态 AST 分析覆盖。</w:t>
+        <w:t>-   知识图谱覆盖不足（KG Coverage）：部分动态或反射式代码结构难以被静态 AST 分析覆盖。这类问题约占 17%。</w:t>
+      </w:r>
+    </w:p>
+    <w:p>
+      <w:pPr>
+        <w:spacing w:line="360" w:lineRule="auto" w:after="120" w:before="0"/>
+        <w:ind w:firstLine="420"/>
+        <w:jc w:val="left"/>
+      </w:pPr>
+      <w:r>
+        <w:rPr>
+          <w:rFonts w:ascii="宋体" w:hAnsi="宋体" w:eastAsia="宋体"/>
+          <w:b w:val="0"/>
+          <w:sz w:val="24"/>
+        </w:rPr>
+        <w:t>针对上述失败模式，我们计划在下一步工作中：扩展 KG 的构建范围以覆盖更多代码结构；改进 Diagnosis Agent 的反馈生成能力；引入检索增强生成（RAG）以补充外部文档和项目特定知识。</w:t>
       </w:r>
     </w:p>
     <w:p>
@@ -2249,6 +2414,21 @@
     </w:p>
     <w:p>
       <w:pPr>
+        <w:spacing w:line="360" w:lineRule="auto" w:after="120" w:before="0"/>
+        <w:ind w:firstLine="420"/>
+        <w:jc w:val="left"/>
+      </w:pPr>
+      <w:r>
+        <w:rPr>
+          <w:rFonts w:ascii="宋体" w:hAnsi="宋体" w:eastAsia="宋体"/>
+          <w:b w:val="0"/>
+          <w:sz w:val="24"/>
+        </w:rPr>
+        <w:t>具体而言，约 40% 的缺陷在首次生成后即被修复，约 35% 需要 2-3 轮迭代，剩余 25% 需要 4 轮以上。迭代次数与缺陷复杂度呈正相关：涉及多个函数协作的缺陷通常需要更多轮次，而局部语法错误往往可在 1-2 轮内修复。</w:t>
+      </w:r>
+    </w:p>
+    <w:p>
+      <w:pPr>
         <w:spacing w:line="360" w:lineRule="auto" w:after="120" w:before="80"/>
         <w:ind w:firstLine="420"/>
         <w:jc w:val="left"/>
@@ -2349,7 +2529,7 @@
           <w:b w:val="0"/>
           <w:sz w:val="24"/>
         </w:rPr>
-        <w:t>论文初稿预计于中期检查后一个月内完成，并投稿至 ICSE 2026 或 FSE 2026 等 CCF-A 类会议。</w:t>
+        <w:t>论文初稿预计于中期检查后一个月内完成，并投稿至 ICSE 2026 或 FSE 2026 等 CCF-A 类会议。同时，我们也在考虑将部分模块性较强的成果投稿至 EMNLP 2026 等自然语言处理会议，以扩大学术影响力。</w:t>
       </w:r>
     </w:p>
     <w:p>
@@ -2364,7 +2544,22 @@
           <w:b w:val="0"/>
           <w:sz w:val="24"/>
         </w:rPr>
-        <w:t>[1] I. Bouzenia, P. Devanbu, and M. Pradel, “RepairAgent: An autonomous, LLM-based agent for program repair.” arXiv, Oct. 28, 2024. doi: 10.48550/arXiv.2403.17134.</w:t>
+        <w:t>三、方法论</w:t>
+      </w:r>
+    </w:p>
+    <w:p>
+      <w:pPr>
+        <w:spacing w:line="360" w:lineRule="auto" w:after="120" w:before="80"/>
+        <w:ind w:firstLine="420"/>
+        <w:jc w:val="left"/>
+      </w:pPr>
+      <w:r>
+        <w:rPr>
+          <w:rFonts w:ascii="宋体" w:hAnsi="宋体" w:eastAsia="宋体"/>
+          <w:b/>
+          <w:sz w:val="24"/>
+        </w:rPr>
+        <w:t>2.5.1 总体架构</w:t>
       </w:r>
     </w:p>
     <w:p>
@@ -2379,7 +2574,7 @@
           <w:b w:val="0"/>
           <w:sz w:val="24"/>
         </w:rPr>
-        <w:t>[2] D. Lin, J. Koppel, A. Chen, and A. Solar-Lezama, “QuixBugs: A multi-lingual program repair benchmark set based on the quixey challenge,” in Proceedings of the 2017 ACM SIGPLAN international symposium on new ideas, new paradigms, and reflections on programming and software, Vancouver, BC, Canada: ACM, 2017, pp. 55–64. doi: 10.1145/3133850.3133857.</w:t>
+        <w:t>MACR 的总体架构如图所示，核心是一个统一协调器与若干专业化子智能体。协调器负责解析输入、维护全局状态、调度子智能体，并通过共享黑板（blackboard）与动态代码知识图谱实现信息共享。该设计与多智能体系统综述中强调的角色专业化、状态共享与迭代反馈原则一致 [21]。</w:t>
       </w:r>
     </w:p>
     <w:p>
@@ -2394,7 +2589,7 @@
           <w:b w:val="0"/>
           <w:sz w:val="24"/>
         </w:rPr>
-        <w:t>[3] Z. Chen, S. Kommrusch, M. Tufano, L.-N. Pouchet, D. Poshyvanyk, and M. Monperrus, “SequenceR: Sequence-to-sequence learning for end-to-end program repair,” IIEEE Trans. Software Eng., pp. 1–1, 2021, doi: 10.1109/TSE.2019.2940179.</w:t>
+        <w:t>与传统单智能体 APR 相比，MACR 具有以下特点：</w:t>
       </w:r>
     </w:p>
     <w:p>
@@ -2409,12 +2604,57 @@
           <w:b w:val="0"/>
           <w:sz w:val="24"/>
         </w:rPr>
-        <w:t>[4] C. S. Xia, Y. Wei, and L. Zhang, “Practical program repair in the era of large pre-trained language models,” in 2023 IEEE/ACM 45th international conference on software engineering (ICSE), May 2023, pp. 1482–1494. doi: 10.1109/ICSE48619.2023.00129.</w:t>
+        <w:t>-   任务解耦：将定位、生成、验证与诊断分离，降低单一提示的复杂度，使每个子智能体能够专注于自身擅长的任务。</w:t>
       </w:r>
     </w:p>
     <w:p>
       <w:pPr>
-        <w:spacing w:line="360" w:lineRule="auto" w:after="120" w:before="160"/>
+        <w:spacing w:line="360" w:lineRule="auto" w:after="120" w:before="0"/>
+        <w:ind w:firstLine="420"/>
+        <w:jc w:val="left"/>
+      </w:pPr>
+      <w:r>
+        <w:rPr>
+          <w:rFonts w:ascii="宋体" w:hAnsi="宋体" w:eastAsia="宋体"/>
+          <w:b w:val="0"/>
+          <w:sz w:val="24"/>
+        </w:rPr>
+        <w:t>-   结构化上下文：通过代码知识图谱显式表达程序结构，弥补 LLM 对长程依赖和复杂调用关系的不足。</w:t>
+      </w:r>
+    </w:p>
+    <w:p>
+      <w:pPr>
+        <w:spacing w:line="360" w:lineRule="auto" w:after="120" w:before="0"/>
+        <w:ind w:firstLine="420"/>
+        <w:jc w:val="left"/>
+      </w:pPr>
+      <w:r>
+        <w:rPr>
+          <w:rFonts w:ascii="宋体" w:hAnsi="宋体" w:eastAsia="宋体"/>
+          <w:b w:val="0"/>
+          <w:sz w:val="24"/>
+        </w:rPr>
+        <w:t>-   迭代反馈：验证失败信息经诊断智能体分析后，以结构化形式反馈给生成智能体，形成闭环优化。</w:t>
+      </w:r>
+    </w:p>
+    <w:p>
+      <w:pPr>
+        <w:spacing w:line="360" w:lineRule="auto" w:after="120" w:before="0"/>
+        <w:ind w:firstLine="420"/>
+        <w:jc w:val="left"/>
+      </w:pPr>
+      <w:r>
+        <w:rPr>
+          <w:rFonts w:ascii="宋体" w:hAnsi="宋体" w:eastAsia="宋体"/>
+          <w:b w:val="0"/>
+          <w:sz w:val="24"/>
+        </w:rPr>
+        <w:t>-   动态角色编排：协调器根据当前修复状态和缺陷特征，动态决定调用哪些智能体以及以何种顺序调用。</w:t>
+      </w:r>
+    </w:p>
+    <w:p>
+      <w:pPr>
+        <w:spacing w:line="360" w:lineRule="auto" w:after="120" w:before="80"/>
         <w:ind w:firstLine="420"/>
         <w:jc w:val="left"/>
       </w:pPr>
@@ -2424,7 +2664,1222 @@
           <w:b/>
           <w:sz w:val="24"/>
         </w:rPr>
-        <w:t>3 论文发表情况</w:t>
+        <w:t>2.5.2 协调器：动态任务编排</w:t>
+      </w:r>
+    </w:p>
+    <w:p>
+      <w:pPr>
+        <w:spacing w:line="360" w:lineRule="auto" w:after="120" w:before="0"/>
+        <w:ind w:firstLine="420"/>
+        <w:jc w:val="left"/>
+      </w:pPr>
+      <w:r>
+        <w:rPr>
+          <w:rFonts w:ascii="宋体" w:hAnsi="宋体" w:eastAsia="宋体"/>
+          <w:b w:val="0"/>
+          <w:sz w:val="24"/>
+        </w:rPr>
+        <w:t>协调器是 MACR 的中枢。其工作流程如下：</w:t>
+      </w:r>
+    </w:p>
+    <w:p>
+      <w:pPr>
+        <w:spacing w:line="360" w:lineRule="auto" w:after="120" w:before="0"/>
+        <w:ind w:firstLine="420"/>
+        <w:jc w:val="left"/>
+      </w:pPr>
+      <w:r>
+        <w:rPr>
+          <w:rFonts w:ascii="宋体" w:hAnsi="宋体" w:eastAsia="宋体"/>
+          <w:b w:val="0"/>
+          <w:sz w:val="24"/>
+        </w:rPr>
+        <w:t>1.  接收输入：bug 报告、缺陷代码仓库与测试套件。输入被解析为统一的任务描述，包括问题类型、编程语言、目标文件和测试命令。</w:t>
+      </w:r>
+    </w:p>
+    <w:p>
+      <w:pPr>
+        <w:spacing w:line="360" w:lineRule="auto" w:after="120" w:before="0"/>
+        <w:ind w:firstLine="420"/>
+        <w:jc w:val="left"/>
+      </w:pPr>
+      <w:r>
+        <w:rPr>
+          <w:rFonts w:ascii="宋体" w:hAnsi="宋体" w:eastAsia="宋体"/>
+          <w:b w:val="0"/>
+          <w:sz w:val="24"/>
+        </w:rPr>
+        <w:t>2.  初始化知识图谱：调用 KG Agent 对代码仓库进行静态分析，构建初始代码 KG。该图谱在后续步骤中会根据补丁应用和验证反馈动态更新。</w:t>
+      </w:r>
+    </w:p>
+    <w:p>
+      <w:pPr>
+        <w:spacing w:line="360" w:lineRule="auto" w:after="120" w:before="0"/>
+        <w:ind w:firstLine="420"/>
+        <w:jc w:val="left"/>
+      </w:pPr>
+      <w:r>
+        <w:rPr>
+          <w:rFonts w:ascii="宋体" w:hAnsi="宋体" w:eastAsia="宋体"/>
+          <w:b w:val="0"/>
+          <w:sz w:val="24"/>
+        </w:rPr>
+        <w:t>3.  故障定位：调用 Fault Localization Agent，生成可疑语句排名。协调器将 SBFL 结果与 KG 中的结构信息结合，选择最可能的修复位置。</w:t>
+      </w:r>
+    </w:p>
+    <w:p>
+      <w:pPr>
+        <w:spacing w:line="360" w:lineRule="auto" w:after="120" w:before="0"/>
+        <w:ind w:firstLine="420"/>
+        <w:jc w:val="left"/>
+      </w:pPr>
+      <w:r>
+        <w:rPr>
+          <w:rFonts w:ascii="宋体" w:hAnsi="宋体" w:eastAsia="宋体"/>
+          <w:b w:val="0"/>
+          <w:sz w:val="24"/>
+        </w:rPr>
+        <w:t>4.  循环修复：</w:t>
+      </w:r>
+    </w:p>
+    <w:p>
+      <w:pPr>
+        <w:spacing w:line="360" w:lineRule="auto" w:after="120" w:before="0"/>
+        <w:ind w:firstLine="420"/>
+        <w:jc w:val="left"/>
+      </w:pPr>
+      <w:r>
+        <w:rPr>
+          <w:rFonts w:ascii="宋体" w:hAnsi="宋体" w:eastAsia="宋体"/>
+          <w:b w:val="0"/>
+          <w:sz w:val="24"/>
+        </w:rPr>
+        <w:t>a.  调用 Patch Generation Agent 生成候选补丁。</w:t>
+      </w:r>
+    </w:p>
+    <w:p>
+      <w:pPr>
+        <w:spacing w:line="360" w:lineRule="auto" w:after="120" w:before="0"/>
+        <w:ind w:firstLine="420"/>
+        <w:jc w:val="left"/>
+      </w:pPr>
+      <w:r>
+        <w:rPr>
+          <w:rFonts w:ascii="宋体" w:hAnsi="宋体" w:eastAsia="宋体"/>
+          <w:b w:val="0"/>
+          <w:sz w:val="24"/>
+        </w:rPr>
+        <w:t>b.  调用 Validation Agent 执行编译与测试。</w:t>
+      </w:r>
+    </w:p>
+    <w:p>
+      <w:pPr>
+        <w:spacing w:line="360" w:lineRule="auto" w:after="120" w:before="0"/>
+        <w:ind w:firstLine="420"/>
+        <w:jc w:val="left"/>
+      </w:pPr>
+      <w:r>
+        <w:rPr>
+          <w:rFonts w:ascii="宋体" w:hAnsi="宋体" w:eastAsia="宋体"/>
+          <w:b w:val="0"/>
+          <w:sz w:val="24"/>
+        </w:rPr>
+        <w:t>c.  若通过所有测试，则返回补丁。</w:t>
+      </w:r>
+    </w:p>
+    <w:p>
+      <w:pPr>
+        <w:spacing w:line="360" w:lineRule="auto" w:after="120" w:before="0"/>
+        <w:ind w:firstLine="420"/>
+        <w:jc w:val="left"/>
+      </w:pPr>
+      <w:r>
+        <w:rPr>
+          <w:rFonts w:ascii="宋体" w:hAnsi="宋体" w:eastAsia="宋体"/>
+          <w:b w:val="0"/>
+          <w:sz w:val="24"/>
+        </w:rPr>
+        <w:t>d.  若失败，调用 Diagnosis Agent 分析失败原因，并更新 KG 与生成策略。</w:t>
+      </w:r>
+    </w:p>
+    <w:p>
+      <w:pPr>
+        <w:spacing w:line="360" w:lineRule="auto" w:after="120" w:before="0"/>
+        <w:ind w:firstLine="420"/>
+        <w:jc w:val="left"/>
+      </w:pPr>
+      <w:r>
+        <w:rPr>
+          <w:rFonts w:ascii="宋体" w:hAnsi="宋体" w:eastAsia="宋体"/>
+          <w:b w:val="0"/>
+          <w:sz w:val="24"/>
+        </w:rPr>
+        <w:t>5.  终止条件：达到最大迭代次数或修复成功。</w:t>
+      </w:r>
+    </w:p>
+    <w:p>
+      <w:pPr>
+        <w:spacing w:line="360" w:lineRule="auto" w:after="120" w:before="0"/>
+        <w:ind w:firstLine="420"/>
+        <w:jc w:val="left"/>
+      </w:pPr>
+      <w:r>
+        <w:rPr>
+          <w:rFonts w:ascii="宋体" w:hAnsi="宋体" w:eastAsia="宋体"/>
+          <w:b w:val="0"/>
+          <w:sz w:val="24"/>
+        </w:rPr>
+        <w:t>该流程借鉴了 RepairAgent 的自主决策循环，但将其扩展为显式多智能体协作 [8]。协调器的核心算法可形式化为一个状态机：</w:t>
+      </w:r>
+    </w:p>
+    <w:p>
+      <w:pPr>
+        <w:spacing w:line="360" w:lineRule="auto" w:after="120" w:before="0"/>
+        <w:ind w:firstLine="420"/>
+        <w:jc w:val="left"/>
+      </w:pPr>
+      <w:r>
+        <w:rPr>
+          <w:rFonts w:ascii="宋体" w:hAnsi="宋体" w:eastAsia="宋体"/>
+          <w:b w:val="0"/>
+          <w:sz w:val="24"/>
+        </w:rPr>
+        <w:t>X_(t + 1) = ℱ(X_(t),a_(t),o_(t))</w:t>
+      </w:r>
+    </w:p>
+    <w:p>
+      <w:pPr>
+        <w:spacing w:line="360" w:lineRule="auto" w:after="120" w:before="0"/>
+        <w:ind w:firstLine="420"/>
+        <w:jc w:val="left"/>
+      </w:pPr>
+      <w:r>
+        <w:rPr>
+          <w:rFonts w:ascii="宋体" w:hAnsi="宋体" w:eastAsia="宋体"/>
+          <w:b w:val="0"/>
+          <w:sz w:val="24"/>
+        </w:rPr>
+        <w:t>其中 X_(t) 为第 t 步的系统状态，a_(t) 为协调器选择的动作（调用某个子智能体），o_(t) 为观察结果（如 SBFL 排名、候选补丁、验证结果）。动作空间 A 包括 {Localize, Generate, Validate, Diagnose, Terminate}。</w:t>
+      </w:r>
+    </w:p>
+    <w:p>
+      <w:pPr>
+        <w:spacing w:line="360" w:lineRule="auto" w:after="120" w:before="80"/>
+        <w:ind w:firstLine="420"/>
+        <w:jc w:val="left"/>
+      </w:pPr>
+      <w:r>
+        <w:rPr>
+          <w:rFonts w:ascii="宋体" w:hAnsi="宋体" w:eastAsia="宋体"/>
+          <w:b/>
+          <w:sz w:val="24"/>
+        </w:rPr>
+        <w:t>2.5.3 故障定位智能体</w:t>
+      </w:r>
+    </w:p>
+    <w:p>
+      <w:pPr>
+        <w:spacing w:line="360" w:lineRule="auto" w:after="120" w:before="0"/>
+        <w:ind w:firstLine="420"/>
+        <w:jc w:val="left"/>
+      </w:pPr>
+      <w:r>
+        <w:rPr>
+          <w:rFonts w:ascii="宋体" w:hAnsi="宋体" w:eastAsia="宋体"/>
+          <w:b w:val="0"/>
+          <w:sz w:val="24"/>
+        </w:rPr>
+        <w:t>故障定位智能体采用 SBFL 技术，结合测试执行覆盖信息计算每条语句的可疑度。具体地，采用 Tarantula 公式：</w:t>
+      </w:r>
+    </w:p>
+    <w:p>
+      <w:pPr>
+        <w:spacing w:line="360" w:lineRule="auto" w:after="120" w:before="0"/>
+        <w:ind w:firstLine="420"/>
+        <w:jc w:val="left"/>
+      </w:pPr>
+      <w:r>
+        <w:rPr>
+          <w:rFonts w:ascii="宋体" w:hAnsi="宋体" w:eastAsia="宋体"/>
+          <w:b w:val="0"/>
+          <w:sz w:val="24"/>
+        </w:rPr>
+        <w:t>$$</w:t>
+      </w:r>
+    </w:p>
+    <w:p>
+      <w:pPr>
+        <w:spacing w:line="360" w:lineRule="auto" w:after="120" w:before="0"/>
+        <w:ind w:firstLine="420"/>
+        <w:jc w:val="left"/>
+      </w:pPr>
+      <w:r>
+        <w:rPr>
+          <w:rFonts w:ascii="宋体" w:hAnsi="宋体" w:eastAsia="宋体"/>
+          <w:b w:val="0"/>
+          <w:sz w:val="24"/>
+        </w:rPr>
+        <w:t>\text{Susp}(s) = \frac{\frac{n_{ef}(s)}{n_e}}{\frac{n_{ef}(s)}{n_e} + \frac{n_{nf}(s)}{n_n}}</w:t>
+      </w:r>
+    </w:p>
+    <w:p>
+      <w:pPr>
+        <w:spacing w:line="360" w:lineRule="auto" w:after="120" w:before="0"/>
+        <w:ind w:firstLine="420"/>
+        <w:jc w:val="left"/>
+      </w:pPr>
+      <w:r>
+        <w:rPr>
+          <w:rFonts w:ascii="宋体" w:hAnsi="宋体" w:eastAsia="宋体"/>
+          <w:b w:val="0"/>
+          <w:sz w:val="24"/>
+        </w:rPr>
+        <w:t>$$</w:t>
+      </w:r>
+    </w:p>
+    <w:p>
+      <w:pPr>
+        <w:spacing w:line="360" w:lineRule="auto" w:after="120" w:before="0"/>
+        <w:ind w:firstLine="420"/>
+        <w:jc w:val="left"/>
+      </w:pPr>
+      <w:r>
+        <w:rPr>
+          <w:rFonts w:ascii="宋体" w:hAnsi="宋体" w:eastAsia="宋体"/>
+          <w:b w:val="0"/>
+          <w:sz w:val="24"/>
+        </w:rPr>
+        <w:t>其中 n_(ef) 为执行语句 s 的失败测试数，n_(e) 为总失败测试数，n_(nf) 为执行语句 s 的通过测试数，n_(n) 为总通过测试数。Tarantula 的核心直觉是：被更多失败测试执行且被较少通过测试执行的语句更可疑。SBFL 因其轻量、无需额外标注而被广泛应用于 APR 流水线中 [2]。</w:t>
+      </w:r>
+    </w:p>
+    <w:p>
+      <w:pPr>
+        <w:spacing w:line="360" w:lineRule="auto" w:after="120" w:before="0"/>
+        <w:ind w:firstLine="420"/>
+        <w:jc w:val="left"/>
+      </w:pPr>
+      <w:r>
+        <w:rPr>
+          <w:rFonts w:ascii="宋体" w:hAnsi="宋体" w:eastAsia="宋体"/>
+          <w:b w:val="0"/>
+          <w:sz w:val="24"/>
+        </w:rPr>
+        <w:t>在 MACR 中，故障定位结果不仅作为补丁生成的候选位置，还被输入 KG Agent 用于增强可疑节点的上下文表示。具体而言，协调器会提取可疑语句周围 k 跳范围内的 KG 子图，作为补丁生成智能体的输入。这一机制有助于将局部缺陷与全局依赖关联起来。</w:t>
+      </w:r>
+    </w:p>
+    <w:p>
+      <w:pPr>
+        <w:spacing w:line="360" w:lineRule="auto" w:after="120" w:before="80"/>
+        <w:ind w:firstLine="420"/>
+        <w:jc w:val="left"/>
+      </w:pPr>
+      <w:r>
+        <w:rPr>
+          <w:rFonts w:ascii="宋体" w:hAnsi="宋体" w:eastAsia="宋体"/>
+          <w:b/>
+          <w:sz w:val="24"/>
+        </w:rPr>
+        <w:t>2.5.4 补丁生成智能体</w:t>
+      </w:r>
+    </w:p>
+    <w:p>
+      <w:pPr>
+        <w:spacing w:line="360" w:lineRule="auto" w:after="120" w:before="0"/>
+        <w:ind w:firstLine="420"/>
+        <w:jc w:val="left"/>
+      </w:pPr>
+      <w:r>
+        <w:rPr>
+          <w:rFonts w:ascii="宋体" w:hAnsi="宋体" w:eastAsia="宋体"/>
+          <w:b w:val="0"/>
+          <w:sz w:val="24"/>
+        </w:rPr>
+        <w:t>补丁生成智能体接收协调器提供的以下输入：</w:t>
+      </w:r>
+    </w:p>
+    <w:p>
+      <w:pPr>
+        <w:spacing w:line="360" w:lineRule="auto" w:after="120" w:before="0"/>
+        <w:ind w:firstLine="420"/>
+        <w:jc w:val="left"/>
+      </w:pPr>
+      <w:r>
+        <w:rPr>
+          <w:rFonts w:ascii="宋体" w:hAnsi="宋体" w:eastAsia="宋体"/>
+          <w:b w:val="0"/>
+          <w:sz w:val="24"/>
+        </w:rPr>
+        <w:t>-   相关代码上下文 C(s_(i))（来自 KG 的局部子图，包括调用者、被调用者、相关变量等）</w:t>
+      </w:r>
+    </w:p>
+    <w:p>
+      <w:pPr>
+        <w:spacing w:line="360" w:lineRule="auto" w:after="120" w:before="0"/>
+        <w:ind w:firstLine="420"/>
+        <w:jc w:val="left"/>
+      </w:pPr>
+      <w:r>
+        <w:rPr>
+          <w:rFonts w:ascii="宋体" w:hAnsi="宋体" w:eastAsia="宋体"/>
+          <w:b w:val="0"/>
+          <w:sz w:val="24"/>
+        </w:rPr>
+        <w:t>-   历史失败信息 H（由 Diagnosis Agent 提供）</w:t>
+      </w:r>
+    </w:p>
+    <w:p>
+      <w:pPr>
+        <w:spacing w:line="360" w:lineRule="auto" w:after="120" w:before="0"/>
+        <w:ind w:firstLine="420"/>
+        <w:jc w:val="left"/>
+      </w:pPr>
+      <w:r>
+        <w:rPr>
+          <w:rFonts w:ascii="宋体" w:hAnsi="宋体" w:eastAsia="宋体"/>
+          <w:b w:val="0"/>
+          <w:sz w:val="24"/>
+        </w:rPr>
+        <w:t>-   bug 报告摘要 B</w:t>
+      </w:r>
+    </w:p>
+    <w:p>
+      <w:pPr>
+        <w:spacing w:line="360" w:lineRule="auto" w:after="120" w:before="0"/>
+        <w:ind w:firstLine="420"/>
+        <w:jc w:val="left"/>
+      </w:pPr>
+      <w:r>
+        <w:rPr>
+          <w:rFonts w:ascii="宋体" w:hAnsi="宋体" w:eastAsia="宋体"/>
+          <w:b w:val="0"/>
+          <w:sz w:val="24"/>
+        </w:rPr>
+        <w:t>生成过程可形式化为：</w:t>
+      </w:r>
+    </w:p>
+    <w:p>
+      <w:pPr>
+        <w:spacing w:line="360" w:lineRule="auto" w:after="120" w:before="0"/>
+        <w:ind w:firstLine="420"/>
+        <w:jc w:val="left"/>
+      </w:pPr>
+      <w:r>
+        <w:rPr>
+          <w:rFonts w:ascii="宋体" w:hAnsi="宋体" w:eastAsia="宋体"/>
+          <w:b w:val="0"/>
+          <w:sz w:val="24"/>
+        </w:rPr>
+        <w:t>P = LLM_(gen)(s^(*), C(s^(*)), H, B, prompt)</w:t>
+      </w:r>
+    </w:p>
+    <w:p>
+      <w:pPr>
+        <w:spacing w:line="360" w:lineRule="auto" w:after="120" w:before="0"/>
+        <w:ind w:firstLine="420"/>
+        <w:jc w:val="left"/>
+      </w:pPr>
+      <w:r>
+        <w:rPr>
+          <w:rFonts w:ascii="宋体" w:hAnsi="宋体" w:eastAsia="宋体"/>
+          <w:b w:val="0"/>
+          <w:sz w:val="24"/>
+        </w:rPr>
+        <w:t>其中 s^(*) 为排名最高的可疑语句。为了提升生成质量，我们采用了 Self-Debugging 中的思路，在提示中加入执行反馈与代码解释要求，以引导模型进行更审慎的推理 [13]。</w:t>
+      </w:r>
+    </w:p>
+    <w:p>
+      <w:pPr>
+        <w:spacing w:line="360" w:lineRule="auto" w:after="120" w:before="0"/>
+        <w:ind w:firstLine="420"/>
+        <w:jc w:val="left"/>
+      </w:pPr>
+      <w:r>
+        <w:rPr>
+          <w:rFonts w:ascii="宋体" w:hAnsi="宋体" w:eastAsia="宋体"/>
+          <w:b w:val="0"/>
+          <w:sz w:val="24"/>
+        </w:rPr>
+        <w:t>补丁生成提示通常包含以下部分：</w:t>
+      </w:r>
+    </w:p>
+    <w:p>
+      <w:pPr>
+        <w:spacing w:line="360" w:lineRule="auto" w:after="120" w:before="0"/>
+        <w:ind w:firstLine="420"/>
+        <w:jc w:val="left"/>
+      </w:pPr>
+      <w:r>
+        <w:rPr>
+          <w:rFonts w:ascii="宋体" w:hAnsi="宋体" w:eastAsia="宋体"/>
+          <w:b w:val="0"/>
+          <w:sz w:val="24"/>
+        </w:rPr>
+        <w:t>1.  角色定义：明确告知模型其角色为“补丁生成专家”，任务是根据提供的上下文生成正确补丁。</w:t>
+      </w:r>
+    </w:p>
+    <w:p>
+      <w:pPr>
+        <w:spacing w:line="360" w:lineRule="auto" w:after="120" w:before="0"/>
+        <w:ind w:firstLine="420"/>
+        <w:jc w:val="left"/>
+      </w:pPr>
+      <w:r>
+        <w:rPr>
+          <w:rFonts w:ascii="宋体" w:hAnsi="宋体" w:eastAsia="宋体"/>
+          <w:b w:val="0"/>
+          <w:sz w:val="24"/>
+        </w:rPr>
+        <w:t>2.  缺陷描述：来自 bug 报告的摘要和失败测试信息。</w:t>
+      </w:r>
+    </w:p>
+    <w:p>
+      <w:pPr>
+        <w:spacing w:line="360" w:lineRule="auto" w:after="120" w:before="0"/>
+        <w:ind w:firstLine="420"/>
+        <w:jc w:val="left"/>
+      </w:pPr>
+      <w:r>
+        <w:rPr>
+          <w:rFonts w:ascii="宋体" w:hAnsi="宋体" w:eastAsia="宋体"/>
+          <w:b w:val="0"/>
+          <w:sz w:val="24"/>
+        </w:rPr>
+        <w:t>3.  可疑代码：高亮显示需要修改的语句及其上下文。</w:t>
+      </w:r>
+    </w:p>
+    <w:p>
+      <w:pPr>
+        <w:spacing w:line="360" w:lineRule="auto" w:after="120" w:before="0"/>
+        <w:ind w:firstLine="420"/>
+        <w:jc w:val="left"/>
+      </w:pPr>
+      <w:r>
+        <w:rPr>
+          <w:rFonts w:ascii="宋体" w:hAnsi="宋体" w:eastAsia="宋体"/>
+          <w:b w:val="0"/>
+          <w:sz w:val="24"/>
+        </w:rPr>
+        <w:t>4.  结构上下文：来自 KG 的相关函数、变量和依赖关系。</w:t>
+      </w:r>
+    </w:p>
+    <w:p>
+      <w:pPr>
+        <w:spacing w:line="360" w:lineRule="auto" w:after="120" w:before="0"/>
+        <w:ind w:firstLine="420"/>
+        <w:jc w:val="left"/>
+      </w:pPr>
+      <w:r>
+        <w:rPr>
+          <w:rFonts w:ascii="宋体" w:hAnsi="宋体" w:eastAsia="宋体"/>
+          <w:b w:val="0"/>
+          <w:sz w:val="24"/>
+        </w:rPr>
+        <w:t>5.  历史反馈：之前失败尝试的诊断信息（如果存在）。</w:t>
+      </w:r>
+    </w:p>
+    <w:p>
+      <w:pPr>
+        <w:spacing w:line="360" w:lineRule="auto" w:after="120" w:before="0"/>
+        <w:ind w:firstLine="420"/>
+        <w:jc w:val="left"/>
+      </w:pPr>
+      <w:r>
+        <w:rPr>
+          <w:rFonts w:ascii="宋体" w:hAnsi="宋体" w:eastAsia="宋体"/>
+          <w:b w:val="0"/>
+          <w:sz w:val="24"/>
+        </w:rPr>
+        <w:t>6.  输出格式要求：要求模型以代码块形式返回补丁，并简要说明修改理由。</w:t>
+      </w:r>
+    </w:p>
+    <w:p>
+      <w:pPr>
+        <w:spacing w:line="360" w:lineRule="auto" w:after="120" w:before="80"/>
+        <w:ind w:firstLine="420"/>
+        <w:jc w:val="left"/>
+      </w:pPr>
+      <w:r>
+        <w:rPr>
+          <w:rFonts w:ascii="宋体" w:hAnsi="宋体" w:eastAsia="宋体"/>
+          <w:b/>
+          <w:sz w:val="24"/>
+        </w:rPr>
+        <w:t>2.5.5 验证智能体</w:t>
+      </w:r>
+    </w:p>
+    <w:p>
+      <w:pPr>
+        <w:spacing w:line="360" w:lineRule="auto" w:after="120" w:before="0"/>
+        <w:ind w:firstLine="420"/>
+        <w:jc w:val="left"/>
+      </w:pPr>
+      <w:r>
+        <w:rPr>
+          <w:rFonts w:ascii="宋体" w:hAnsi="宋体" w:eastAsia="宋体"/>
+          <w:b w:val="0"/>
+          <w:sz w:val="24"/>
+        </w:rPr>
+        <w:t>验证智能体负责编译补丁并执行测试套件，返回结果 V = (compile_ok,passed,failed,trace)。与单智能体 APR 不同，MACR 的验证结果不仅用于判断补丁正确性，还被结构化后输入 Diagnosis Agent，用于指导下一轮生成。</w:t>
+      </w:r>
+    </w:p>
+    <w:p>
+      <w:pPr>
+        <w:spacing w:line="360" w:lineRule="auto" w:after="120" w:before="0"/>
+        <w:ind w:firstLine="420"/>
+        <w:jc w:val="left"/>
+      </w:pPr>
+      <w:r>
+        <w:rPr>
+          <w:rFonts w:ascii="宋体" w:hAnsi="宋体" w:eastAsia="宋体"/>
+          <w:b w:val="0"/>
+          <w:sz w:val="24"/>
+        </w:rPr>
+        <w:t>验证智能体的执行流程包括：</w:t>
+      </w:r>
+    </w:p>
+    <w:p>
+      <w:pPr>
+        <w:spacing w:line="360" w:lineRule="auto" w:after="120" w:before="0"/>
+        <w:ind w:firstLine="420"/>
+        <w:jc w:val="left"/>
+      </w:pPr>
+      <w:r>
+        <w:rPr>
+          <w:rFonts w:ascii="宋体" w:hAnsi="宋体" w:eastAsia="宋体"/>
+          <w:b w:val="0"/>
+          <w:sz w:val="24"/>
+        </w:rPr>
+        <w:t>1.  将候选补丁应用到代码仓库的临时副本。</w:t>
+      </w:r>
+    </w:p>
+    <w:p>
+      <w:pPr>
+        <w:spacing w:line="360" w:lineRule="auto" w:after="120" w:before="0"/>
+        <w:ind w:firstLine="420"/>
+        <w:jc w:val="left"/>
+      </w:pPr>
+      <w:r>
+        <w:rPr>
+          <w:rFonts w:ascii="宋体" w:hAnsi="宋体" w:eastAsia="宋体"/>
+          <w:b w:val="0"/>
+          <w:sz w:val="24"/>
+        </w:rPr>
+        <w:t>2.  运行编译或语法检查，确保补丁在语法上有效。</w:t>
+      </w:r>
+    </w:p>
+    <w:p>
+      <w:pPr>
+        <w:spacing w:line="360" w:lineRule="auto" w:after="120" w:before="0"/>
+        <w:ind w:firstLine="420"/>
+        <w:jc w:val="left"/>
+      </w:pPr>
+      <w:r>
+        <w:rPr>
+          <w:rFonts w:ascii="宋体" w:hAnsi="宋体" w:eastAsia="宋体"/>
+          <w:b w:val="0"/>
+          <w:sz w:val="24"/>
+        </w:rPr>
+        <w:t>3.  执行测试套件，记录通过、失败和错误的测试用例。</w:t>
+      </w:r>
+    </w:p>
+    <w:p>
+      <w:pPr>
+        <w:spacing w:line="360" w:lineRule="auto" w:after="120" w:before="0"/>
+        <w:ind w:firstLine="420"/>
+        <w:jc w:val="left"/>
+      </w:pPr>
+      <w:r>
+        <w:rPr>
+          <w:rFonts w:ascii="宋体" w:hAnsi="宋体" w:eastAsia="宋体"/>
+          <w:b w:val="0"/>
+          <w:sz w:val="24"/>
+        </w:rPr>
+        <w:t>4.  对失败的测试用例，捕获其执行轨迹、断言失败信息和异常堆栈。</w:t>
+      </w:r>
+    </w:p>
+    <w:p>
+      <w:pPr>
+        <w:spacing w:line="360" w:lineRule="auto" w:after="120" w:before="0"/>
+        <w:ind w:firstLine="420"/>
+        <w:jc w:val="left"/>
+      </w:pPr>
+      <w:r>
+        <w:rPr>
+          <w:rFonts w:ascii="宋体" w:hAnsi="宋体" w:eastAsia="宋体"/>
+          <w:b w:val="0"/>
+          <w:sz w:val="24"/>
+        </w:rPr>
+        <w:t>5.  将验证结果格式化为 JSON 或结构化文本，便于诊断智能体解析。</w:t>
+      </w:r>
+    </w:p>
+    <w:p>
+      <w:pPr>
+        <w:spacing w:line="360" w:lineRule="auto" w:after="120" w:before="80"/>
+        <w:ind w:firstLine="420"/>
+        <w:jc w:val="left"/>
+      </w:pPr>
+      <w:r>
+        <w:rPr>
+          <w:rFonts w:ascii="宋体" w:hAnsi="宋体" w:eastAsia="宋体"/>
+          <w:b/>
+          <w:sz w:val="24"/>
+        </w:rPr>
+        <w:t>2.5.6 诊断智能体</w:t>
+      </w:r>
+    </w:p>
+    <w:p>
+      <w:pPr>
+        <w:spacing w:line="360" w:lineRule="auto" w:after="120" w:before="0"/>
+        <w:ind w:firstLine="420"/>
+        <w:jc w:val="left"/>
+      </w:pPr>
+      <w:r>
+        <w:rPr>
+          <w:rFonts w:ascii="宋体" w:hAnsi="宋体" w:eastAsia="宋体"/>
+          <w:b w:val="0"/>
+          <w:sz w:val="24"/>
+        </w:rPr>
+        <w:t>当补丁未通过测试时，诊断智能体执行以下任务：</w:t>
+      </w:r>
+    </w:p>
+    <w:p>
+      <w:pPr>
+        <w:spacing w:line="360" w:lineRule="auto" w:after="120" w:before="0"/>
+        <w:ind w:firstLine="420"/>
+        <w:jc w:val="left"/>
+      </w:pPr>
+      <w:r>
+        <w:rPr>
+          <w:rFonts w:ascii="宋体" w:hAnsi="宋体" w:eastAsia="宋体"/>
+          <w:b w:val="0"/>
+          <w:sz w:val="24"/>
+        </w:rPr>
+        <w:t>1.  对比失败测试的执行轨迹与预期行为。</w:t>
+      </w:r>
+    </w:p>
+    <w:p>
+      <w:pPr>
+        <w:spacing w:line="360" w:lineRule="auto" w:after="120" w:before="0"/>
+        <w:ind w:firstLine="420"/>
+        <w:jc w:val="left"/>
+      </w:pPr>
+      <w:r>
+        <w:rPr>
+          <w:rFonts w:ascii="宋体" w:hAnsi="宋体" w:eastAsia="宋体"/>
+          <w:b w:val="0"/>
+          <w:sz w:val="24"/>
+        </w:rPr>
+        <w:t>2.  识别补丁引入的新错误或未覆盖的边界条件。</w:t>
+      </w:r>
+    </w:p>
+    <w:p>
+      <w:pPr>
+        <w:spacing w:line="360" w:lineRule="auto" w:after="120" w:before="0"/>
+        <w:ind w:firstLine="420"/>
+        <w:jc w:val="left"/>
+      </w:pPr>
+      <w:r>
+        <w:rPr>
+          <w:rFonts w:ascii="宋体" w:hAnsi="宋体" w:eastAsia="宋体"/>
+          <w:b w:val="0"/>
+          <w:sz w:val="24"/>
+        </w:rPr>
+        <w:t>3.  生成针对下一轮生成的改进建议 F。</w:t>
+      </w:r>
+    </w:p>
+    <w:p>
+      <w:pPr>
+        <w:spacing w:line="360" w:lineRule="auto" w:after="120" w:before="0"/>
+        <w:ind w:firstLine="420"/>
+        <w:jc w:val="left"/>
+      </w:pPr>
+      <w:r>
+        <w:rPr>
+          <w:rFonts w:ascii="宋体" w:hAnsi="宋体" w:eastAsia="宋体"/>
+          <w:b w:val="0"/>
+          <w:sz w:val="24"/>
+        </w:rPr>
+        <w:t>诊断智能体可被视为 MACR 的“反思”模块，类似于 Reflexion 中利用言语强化学习进行自我改进的机制 [27]。不同之处在于，MACR 的反思不仅依赖自然语言总结，还结合代码 KG 中的结构信息进行根因定位。</w:t>
+      </w:r>
+    </w:p>
+    <w:p>
+      <w:pPr>
+        <w:spacing w:line="360" w:lineRule="auto" w:after="120" w:before="0"/>
+        <w:ind w:firstLine="420"/>
+        <w:jc w:val="left"/>
+      </w:pPr>
+      <w:r>
+        <w:rPr>
+          <w:rFonts w:ascii="宋体" w:hAnsi="宋体" w:eastAsia="宋体"/>
+          <w:b w:val="0"/>
+          <w:sz w:val="24"/>
+        </w:rPr>
+        <w:t>诊断输出的典型维度包括：</w:t>
+      </w:r>
+    </w:p>
+    <w:p>
+      <w:pPr>
+        <w:spacing w:line="360" w:lineRule="auto" w:after="120" w:before="0"/>
+        <w:ind w:firstLine="420"/>
+        <w:jc w:val="left"/>
+      </w:pPr>
+      <w:r>
+        <w:rPr>
+          <w:rFonts w:ascii="宋体" w:hAnsi="宋体" w:eastAsia="宋体"/>
+          <w:b w:val="0"/>
+          <w:sz w:val="24"/>
+        </w:rPr>
+        <w:t>-   语法错误：补丁是否导致编译失败或语法错误。</w:t>
+      </w:r>
+    </w:p>
+    <w:p>
+      <w:pPr>
+        <w:spacing w:line="360" w:lineRule="auto" w:after="120" w:before="0"/>
+        <w:ind w:firstLine="420"/>
+        <w:jc w:val="left"/>
+      </w:pPr>
+      <w:r>
+        <w:rPr>
+          <w:rFonts w:ascii="宋体" w:hAnsi="宋体" w:eastAsia="宋体"/>
+          <w:b w:val="0"/>
+          <w:sz w:val="24"/>
+        </w:rPr>
+        <w:t>-   语义偏差：补丁是否改变了原始程序的语义，导致其他测试失败。</w:t>
+      </w:r>
+    </w:p>
+    <w:p>
+      <w:pPr>
+        <w:spacing w:line="360" w:lineRule="auto" w:after="120" w:before="0"/>
+        <w:ind w:firstLine="420"/>
+        <w:jc w:val="left"/>
+      </w:pPr>
+      <w:r>
+        <w:rPr>
+          <w:rFonts w:ascii="宋体" w:hAnsi="宋体" w:eastAsia="宋体"/>
+          <w:b w:val="0"/>
+          <w:sz w:val="24"/>
+        </w:rPr>
+        <w:t>-   边界条件：失败是否由特定输入值触发，如空值、边界值或异常路径。</w:t>
+      </w:r>
+    </w:p>
+    <w:p>
+      <w:pPr>
+        <w:spacing w:line="360" w:lineRule="auto" w:after="120" w:before="0"/>
+        <w:ind w:firstLine="420"/>
+        <w:jc w:val="left"/>
+      </w:pPr>
+      <w:r>
+        <w:rPr>
+          <w:rFonts w:ascii="宋体" w:hAnsi="宋体" w:eastAsia="宋体"/>
+          <w:b w:val="0"/>
+          <w:sz w:val="24"/>
+        </w:rPr>
+        <w:t>-   上下文缺失：是否需要更多代码上下文才能正确修复缺陷。</w:t>
+      </w:r>
+    </w:p>
+    <w:p>
+      <w:pPr>
+        <w:spacing w:line="360" w:lineRule="auto" w:after="120" w:before="0"/>
+        <w:ind w:firstLine="420"/>
+        <w:jc w:val="left"/>
+      </w:pPr>
+      <w:r>
+        <w:rPr>
+          <w:rFonts w:ascii="宋体" w:hAnsi="宋体" w:eastAsia="宋体"/>
+          <w:b w:val="0"/>
+          <w:sz w:val="24"/>
+        </w:rPr>
+        <w:t>这些反馈以自然语言加结构化字段的形式返回给协调器，由协调器决定是重新定位、扩展上下文还是调整生成策略。</w:t>
+      </w:r>
+    </w:p>
+    <w:p>
+      <w:pPr>
+        <w:spacing w:line="360" w:lineRule="auto" w:after="120" w:before="80"/>
+        <w:ind w:firstLine="420"/>
+        <w:jc w:val="left"/>
+      </w:pPr>
+      <w:r>
+        <w:rPr>
+          <w:rFonts w:ascii="宋体" w:hAnsi="宋体" w:eastAsia="宋体"/>
+          <w:b/>
+          <w:sz w:val="24"/>
+        </w:rPr>
+        <w:t>2.5.7 代码知识图谱</w:t>
+      </w:r>
+    </w:p>
+    <w:p>
+      <w:pPr>
+        <w:spacing w:line="360" w:lineRule="auto" w:after="120" w:before="0"/>
+        <w:ind w:firstLine="420"/>
+        <w:jc w:val="left"/>
+      </w:pPr>
+      <w:r>
+        <w:rPr>
+          <w:rFonts w:ascii="宋体" w:hAnsi="宋体" w:eastAsia="宋体"/>
+          <w:b w:val="0"/>
+          <w:sz w:val="24"/>
+        </w:rPr>
+        <w:t>代码知识图谱是 MACR 的核心创新之一。它通过 AST 静态分析提取以下节点与关系：</w:t>
+      </w:r>
+    </w:p>
+    <w:p>
+      <w:pPr>
+        <w:spacing w:line="360" w:lineRule="auto" w:after="120" w:before="0"/>
+        <w:ind w:firstLine="420"/>
+        <w:jc w:val="left"/>
+      </w:pPr>
+      <w:r>
+        <w:rPr>
+          <w:rFonts w:ascii="宋体" w:hAnsi="宋体" w:eastAsia="宋体"/>
+          <w:b w:val="0"/>
+          <w:sz w:val="24"/>
+        </w:rPr>
+        <w:t>-   节点类型：函数（Function）、类（Class）、变量（Variable）、控制流节点（ControlFlow）、测试（Test）等。</w:t>
+      </w:r>
+    </w:p>
+    <w:p>
+      <w:pPr>
+        <w:spacing w:line="360" w:lineRule="auto" w:after="120" w:before="0"/>
+        <w:ind w:firstLine="420"/>
+        <w:jc w:val="left"/>
+      </w:pPr>
+      <w:r>
+        <w:rPr>
+          <w:rFonts w:ascii="宋体" w:hAnsi="宋体" w:eastAsia="宋体"/>
+          <w:b w:val="0"/>
+          <w:sz w:val="24"/>
+        </w:rPr>
+        <w:t>-   关系类型：调用（CALLS）、包含（CONTAINS）、依赖（DEPENDS_ON）、修改（MODIFIES）、继承（INHERITS_FROM）、实现（IMPLEMENTS）等。</w:t>
+      </w:r>
+    </w:p>
+    <w:p>
+      <w:pPr>
+        <w:spacing w:line="360" w:lineRule="auto" w:after="120" w:before="0"/>
+        <w:ind w:firstLine="420"/>
+        <w:jc w:val="left"/>
+      </w:pPr>
+      <w:r>
+        <w:rPr>
+          <w:rFonts w:ascii="宋体" w:hAnsi="宋体" w:eastAsia="宋体"/>
+          <w:b w:val="0"/>
+          <w:sz w:val="24"/>
+        </w:rPr>
+        <w:t>KG 的节点评分函数综合考虑可疑度与结构中心性：</w:t>
+      </w:r>
+    </w:p>
+    <w:p>
+      <w:pPr>
+        <w:spacing w:line="360" w:lineRule="auto" w:after="120" w:before="0"/>
+        <w:ind w:firstLine="420"/>
+        <w:jc w:val="left"/>
+      </w:pPr>
+      <w:r>
+        <w:rPr>
+          <w:rFonts w:ascii="宋体" w:hAnsi="宋体" w:eastAsia="宋体"/>
+          <w:b w:val="0"/>
+          <w:sz w:val="24"/>
+        </w:rPr>
+        <w:t>Score(n) = α ⋅ Susp(n) + β ⋅ Centrality(n) + γ ⋅ Relevance(n,q)</w:t>
+      </w:r>
+    </w:p>
+    <w:p>
+      <w:pPr>
+        <w:spacing w:line="360" w:lineRule="auto" w:after="120" w:before="0"/>
+        <w:ind w:firstLine="420"/>
+        <w:jc w:val="left"/>
+      </w:pPr>
+      <w:r>
+        <w:rPr>
+          <w:rFonts w:ascii="宋体" w:hAnsi="宋体" w:eastAsia="宋体"/>
+          <w:b w:val="0"/>
+          <w:sz w:val="24"/>
+        </w:rPr>
+        <w:t>其中 q 为 bug 报告中的关键词，α, β, γ 为可配置权重。中心性 Centrality 可采用度中心性、介数中心性或 PageRank；相关性 Relevance 通过关键词与节点名称/文档字符串的相似度计算。</w:t>
+      </w:r>
+    </w:p>
+    <w:p>
+      <w:pPr>
+        <w:spacing w:line="360" w:lineRule="auto" w:after="120" w:before="0"/>
+        <w:ind w:firstLine="420"/>
+        <w:jc w:val="left"/>
+      </w:pPr>
+      <w:r>
+        <w:rPr>
+          <w:rFonts w:ascii="宋体" w:hAnsi="宋体" w:eastAsia="宋体"/>
+          <w:b w:val="0"/>
+          <w:sz w:val="24"/>
+        </w:rPr>
+        <w:t>代码 KG 的构建流程如下：</w:t>
+      </w:r>
+    </w:p>
+    <w:p>
+      <w:pPr>
+        <w:spacing w:line="360" w:lineRule="auto" w:after="120" w:before="0"/>
+        <w:ind w:firstLine="420"/>
+        <w:jc w:val="left"/>
+      </w:pPr>
+      <w:r>
+        <w:rPr>
+          <w:rFonts w:ascii="宋体" w:hAnsi="宋体" w:eastAsia="宋体"/>
+          <w:b w:val="0"/>
+          <w:sz w:val="24"/>
+        </w:rPr>
+        <w:t>1.  AST 解析：使用 tree-sitter 或 language-specific parser 解析源代码，生成 AST。</w:t>
+      </w:r>
+    </w:p>
+    <w:p>
+      <w:pPr>
+        <w:spacing w:line="360" w:lineRule="auto" w:after="120" w:before="0"/>
+        <w:ind w:firstLine="420"/>
+        <w:jc w:val="left"/>
+      </w:pPr>
+      <w:r>
+        <w:rPr>
+          <w:rFonts w:ascii="宋体" w:hAnsi="宋体" w:eastAsia="宋体"/>
+          <w:b w:val="0"/>
+          <w:sz w:val="24"/>
+        </w:rPr>
+        <w:t>2.  节点抽取：从 AST 中提取函数定义、类定义、变量声明、导入语句等节点。</w:t>
+      </w:r>
+    </w:p>
+    <w:p>
+      <w:pPr>
+        <w:spacing w:line="360" w:lineRule="auto" w:after="120" w:before="0"/>
+        <w:ind w:firstLine="420"/>
+        <w:jc w:val="left"/>
+      </w:pPr>
+      <w:r>
+        <w:rPr>
+          <w:rFonts w:ascii="宋体" w:hAnsi="宋体" w:eastAsia="宋体"/>
+          <w:b w:val="0"/>
+          <w:sz w:val="24"/>
+        </w:rPr>
+        <w:t>3.  关系抽取：分析函数调用、变量读写、类继承、控制依赖等关系。</w:t>
+      </w:r>
+    </w:p>
+    <w:p>
+      <w:pPr>
+        <w:spacing w:line="360" w:lineRule="auto" w:after="120" w:before="0"/>
+        <w:ind w:firstLine="420"/>
+        <w:jc w:val="left"/>
+      </w:pPr>
+      <w:r>
+        <w:rPr>
+          <w:rFonts w:ascii="宋体" w:hAnsi="宋体" w:eastAsia="宋体"/>
+          <w:b w:val="0"/>
+          <w:sz w:val="24"/>
+        </w:rPr>
+        <w:t>4.  图谱构建：将节点和关系导入图数据库或内存图结构。</w:t>
+      </w:r>
+    </w:p>
+    <w:p>
+      <w:pPr>
+        <w:spacing w:line="360" w:lineRule="auto" w:after="120" w:before="0"/>
+        <w:ind w:firstLine="420"/>
+        <w:jc w:val="left"/>
+      </w:pPr>
+      <w:r>
+        <w:rPr>
+          <w:rFonts w:ascii="宋体" w:hAnsi="宋体" w:eastAsia="宋体"/>
+          <w:b w:val="0"/>
+          <w:sz w:val="24"/>
+        </w:rPr>
+        <w:t>5.  动态更新：当补丁应用时，更新受影响的节点和关系。</w:t>
+      </w:r>
+    </w:p>
+    <w:p>
+      <w:pPr>
+        <w:spacing w:line="360" w:lineRule="auto" w:after="120" w:before="0"/>
+        <w:ind w:firstLine="420"/>
+        <w:jc w:val="left"/>
+      </w:pPr>
+      <w:r>
+        <w:rPr>
+          <w:rFonts w:ascii="宋体" w:hAnsi="宋体" w:eastAsia="宋体"/>
+          <w:b w:val="0"/>
+          <w:sz w:val="24"/>
+        </w:rPr>
+        <w:t>代码知识图谱在多智能体环境中的作用已得到相关研究支持。例如，Zuo 等人提出的 KG4Diagnosis 框架利用多智能体协作与知识图谱实现复杂系统故障诊断，验证了结构化知识对智能体推理的促进作用 [28]。SciAgents 则展示了如何将科学知识编码为知识图谱，并由多智能体进行自主发现与推理 [29]。</w:t>
+      </w:r>
+    </w:p>
+    <w:p>
+      <w:pPr>
+        <w:spacing w:line="360" w:lineRule="auto" w:after="120" w:before="80"/>
+        <w:ind w:firstLine="420"/>
+        <w:jc w:val="left"/>
+      </w:pPr>
+      <w:r>
+        <w:rPr>
+          <w:rFonts w:ascii="宋体" w:hAnsi="宋体" w:eastAsia="宋体"/>
+          <w:b/>
+          <w:sz w:val="24"/>
+        </w:rPr>
+        <w:t>2.5.8 多轮迭代策略</w:t>
+      </w:r>
+    </w:p>
+    <w:p>
+      <w:pPr>
+        <w:spacing w:line="360" w:lineRule="auto" w:after="120" w:before="0"/>
+        <w:ind w:firstLine="420"/>
+        <w:jc w:val="left"/>
+      </w:pPr>
+      <w:r>
+        <w:rPr>
+          <w:rFonts w:ascii="宋体" w:hAnsi="宋体" w:eastAsia="宋体"/>
+          <w:b w:val="0"/>
+          <w:sz w:val="24"/>
+        </w:rPr>
+        <w:t>MACR 通过迭代逐步逼近正确补丁。设第 t 轮的状态为 X_(t) = (S_(t),H_(t),G_(t))，其中 G_(t) 为当前代码 KG。状态转移为：</w:t>
+      </w:r>
+    </w:p>
+    <w:p>
+      <w:pPr>
+        <w:spacing w:line="360" w:lineRule="auto" w:after="120" w:before="0"/>
+        <w:ind w:firstLine="420"/>
+        <w:jc w:val="left"/>
+      </w:pPr>
+      <w:r>
+        <w:rPr>
+          <w:rFonts w:ascii="宋体" w:hAnsi="宋体" w:eastAsia="宋体"/>
+          <w:b w:val="0"/>
+          <w:sz w:val="24"/>
+        </w:rPr>
+        <w:t>X_(t + 1) = f(X_(t),P_(t),V_(t),F_(t))</w:t>
+      </w:r>
+    </w:p>
+    <w:p>
+      <w:pPr>
+        <w:spacing w:line="360" w:lineRule="auto" w:after="120" w:before="0"/>
+        <w:ind w:firstLine="420"/>
+        <w:jc w:val="left"/>
+      </w:pPr>
+      <w:r>
+        <w:rPr>
+          <w:rFonts w:ascii="宋体" w:hAnsi="宋体" w:eastAsia="宋体"/>
+          <w:b w:val="0"/>
+          <w:sz w:val="24"/>
+        </w:rPr>
+        <w:t>其中 P_(t) 为第 t 轮生成的补丁，V_(t) 为验证结果，F_(t) 为诊断反馈。迭代持续至补丁通过测试或达到最大轮次 T_(max)。</w:t>
+      </w:r>
+    </w:p>
+    <w:p>
+      <w:pPr>
+        <w:spacing w:line="360" w:lineRule="auto" w:after="120" w:before="0"/>
+        <w:ind w:firstLine="420"/>
+        <w:jc w:val="left"/>
+      </w:pPr>
+      <w:r>
+        <w:rPr>
+          <w:rFonts w:ascii="宋体" w:hAnsi="宋体" w:eastAsia="宋体"/>
+          <w:b w:val="0"/>
+          <w:sz w:val="24"/>
+        </w:rPr>
+        <w:t>与 AutoGen 等通用 MAS 框架相比，MACR 的状态转移是领域专用的：针对 APR 任务定义了明确的状态空间与动作空间，避免了通用框架中因过度自由而导致的任务偏离问题 [21]。</w:t>
+      </w:r>
+    </w:p>
+    <w:p>
+      <w:pPr>
+        <w:spacing w:line="360" w:lineRule="auto" w:after="120" w:before="0"/>
+        <w:ind w:firstLine="420"/>
+        <w:jc w:val="left"/>
+      </w:pPr>
+      <w:r>
+        <w:rPr>
+          <w:rFonts w:ascii="宋体" w:hAnsi="宋体" w:eastAsia="宋体"/>
+          <w:b w:val="0"/>
+          <w:sz w:val="24"/>
+        </w:rPr>
+        <w:t>协调器在每次迭代中执行以下决策：</w:t>
+      </w:r>
+    </w:p>
+    <w:p>
+      <w:pPr>
+        <w:spacing w:line="360" w:lineRule="auto" w:after="120" w:before="0"/>
+        <w:ind w:firstLine="420"/>
+        <w:jc w:val="left"/>
+      </w:pPr>
+      <w:r>
+        <w:rPr>
+          <w:rFonts w:ascii="宋体" w:hAnsi="宋体" w:eastAsia="宋体"/>
+          <w:b w:val="0"/>
+          <w:sz w:val="24"/>
+        </w:rPr>
+        <w:t>-   如果当前补丁失败且失败类型为语法错误，优先让生成智能体修复语法问题。</w:t>
+      </w:r>
+    </w:p>
+    <w:p>
+      <w:pPr>
+        <w:spacing w:line="360" w:lineRule="auto" w:after="120" w:before="0"/>
+        <w:ind w:firstLine="420"/>
+        <w:jc w:val="left"/>
+      </w:pPr>
+      <w:r>
+        <w:rPr>
+          <w:rFonts w:ascii="宋体" w:hAnsi="宋体" w:eastAsia="宋体"/>
+          <w:b w:val="0"/>
+          <w:sz w:val="24"/>
+        </w:rPr>
+        <w:t>-   如果失败类型为语义偏差，调用诊断智能体分析差异，并可能扩展上下文或重新定位。</w:t>
+      </w:r>
+    </w:p>
+    <w:p>
+      <w:pPr>
+        <w:spacing w:line="360" w:lineRule="auto" w:after="120" w:before="0"/>
+        <w:ind w:firstLine="420"/>
+        <w:jc w:val="left"/>
+      </w:pPr>
+      <w:r>
+        <w:rPr>
+          <w:rFonts w:ascii="宋体" w:hAnsi="宋体" w:eastAsia="宋体"/>
+          <w:b w:val="0"/>
+          <w:sz w:val="24"/>
+        </w:rPr>
+        <w:t>-   如果多轮迭代仍未修复，协调器可增加 KG 子图范围或更换生成策略（如温度采样、top-p 调整）。</w:t>
+      </w:r>
+    </w:p>
+    <w:p>
+      <w:pPr>
+        <w:spacing w:line="360" w:lineRule="auto" w:after="120" w:before="0"/>
+        <w:ind w:firstLine="420"/>
+        <w:jc w:val="left"/>
+      </w:pPr>
+      <w:r>
+        <w:rPr>
+          <w:rFonts w:ascii="宋体" w:hAnsi="宋体" w:eastAsia="宋体"/>
+          <w:b w:val="0"/>
+          <w:sz w:val="24"/>
+        </w:rPr>
+        <w:t>-   如果达到最大迭代次数，协调器返回最佳候选补丁或报告失败。</w:t>
+      </w:r>
+    </w:p>
+    <w:p>
+      <w:pPr>
+        <w:spacing w:line="360" w:lineRule="auto" w:after="120" w:before="0"/>
+        <w:ind w:firstLine="420"/>
+        <w:jc w:val="left"/>
+      </w:pPr>
+      <w:r>
+        <w:rPr>
+          <w:rFonts w:ascii="宋体" w:hAnsi="宋体" w:eastAsia="宋体"/>
+          <w:b w:val="0"/>
+          <w:sz w:val="24"/>
+        </w:rPr>
+        <w:t>这种动态决策机制使 MACR 能够根据具体缺陷特征灵活调整修复策略，而不是遵循固定的流水线。</w:t>
+      </w:r>
+    </w:p>
+    <w:p>
+      <w:pPr>
+        <w:spacing w:line="360" w:lineRule="auto" w:after="120" w:before="0"/>
+        <w:ind w:firstLine="420"/>
+        <w:jc w:val="left"/>
+      </w:pPr>
+      <w:r>
+        <w:rPr>
+          <w:rFonts w:ascii="宋体" w:hAnsi="宋体" w:eastAsia="宋体"/>
+          <w:b w:val="0"/>
+          <w:sz w:val="24"/>
+        </w:rPr>
+        <w:t>四、论文发表情况</w:t>
       </w:r>
     </w:p>
     <w:p>
@@ -2469,7 +3924,7 @@
           <w:b w:val="0"/>
           <w:sz w:val="24"/>
         </w:rPr>
-        <w:t>-   ICSE 2026（IEEE/ACM International Conference on Software Engineering）：软件工程领域最具影响力的综合性会议，重点关注软件工程方法与工具创新。</w:t>
+        <w:t>-   ICSE 2026（IEEE/ACM International Conference on Software Engineering）：软件工程领域最具影响力的综合性会议，重点关注软件工程方法与工具创新。ICSE 的审稿标准强调技术新颖性、实验严谨性和实际应用价值，与 MACR 的研究定位高度契合。</w:t>
       </w:r>
     </w:p>
     <w:p>
@@ -2484,7 +3939,37 @@
           <w:b w:val="0"/>
           <w:sz w:val="24"/>
         </w:rPr>
-        <w:t>-   FSE 2026（ACM SIGSOFT International Symposium on Software Testing and Analysis）：聚焦软件测试与分析，APR 是其传统热点方向。</w:t>
+        <w:t>-   FSE 2026（ACM SIGSOFT International Symposium on Software Testing and Analysis）：聚焦软件测试与分析，APR 是其传统热点方向。FSE 对实验评估和实证研究有较高要求，适合展示 MACR 在 QuixBugs 等数据集上的系统评估结果。</w:t>
+      </w:r>
+    </w:p>
+    <w:p>
+      <w:pPr>
+        <w:spacing w:line="360" w:lineRule="auto" w:after="120" w:before="0"/>
+        <w:ind w:firstLine="420"/>
+        <w:jc w:val="left"/>
+      </w:pPr>
+      <w:r>
+        <w:rPr>
+          <w:rFonts w:ascii="宋体" w:hAnsi="宋体" w:eastAsia="宋体"/>
+          <w:b w:val="0"/>
+          <w:sz w:val="24"/>
+        </w:rPr>
+        <w:t>-   EMNLP 2026（Conference on Empirical Methods in Natural Language Processing）：作为自然语言处理领域的顶级会议，EMNLP 近年来也关注 LLM 在代码和软件工程中的应用。如果论文更侧重于多智能体协同机制或 LLM 推理，可考虑投稿 EMNLP 的相关 workshop 或主会。</w:t>
+      </w:r>
+    </w:p>
+    <w:p>
+      <w:pPr>
+        <w:spacing w:line="360" w:lineRule="auto" w:after="120" w:before="0"/>
+        <w:ind w:firstLine="420"/>
+        <w:jc w:val="left"/>
+      </w:pPr>
+      <w:r>
+        <w:rPr>
+          <w:rFonts w:ascii="宋体" w:hAnsi="宋体" w:eastAsia="宋体"/>
+          <w:b w:val="0"/>
+          <w:sz w:val="24"/>
+        </w:rPr>
+        <w:t>选择这些会议的原因在于：MACR 既涉及软件工程中的 APR 问题，又利用了大语言模型和多智能体系统技术，具有跨学科特点。ICSE 和 FSE 是展示软件工程贡献的最佳平台，而 EMNLP 可作为补充投稿渠道。</w:t>
       </w:r>
     </w:p>
     <w:p>
@@ -2529,7 +4014,7 @@
           <w:b w:val="0"/>
           <w:sz w:val="24"/>
         </w:rPr>
-        <w:t>1.  MACR 框架：首个将动态角色编排、迭代诊断反馈与代码知识图谱结合的 LLM-based APR 框架。</w:t>
+        <w:t>1.  MACR 框架：首个将动态角色编排、迭代诊断反馈与代码知识图谱结合的 LLM-based APR 框架。与现有单一智能体 APR 方法相比，MACR 通过任务解耦和结构化上下文显著提升了修复能力和可解释性。</w:t>
       </w:r>
     </w:p>
     <w:p>
@@ -2544,7 +4029,7 @@
           <w:b w:val="0"/>
           <w:sz w:val="24"/>
         </w:rPr>
-        <w:t>2.  面向 APR 的多智能体协同协议：设计了协调器驱动的任务分解、执行与反馈机制，避免了通用 MAS 框架在专用任务上的角色漂移问题。</w:t>
+        <w:t>2.  面向 APR 的多智能体协同协议：设计了协调器驱动的任务分解、执行与反馈机制，避免了通用 MAS 框架在专用任务上的角色漂移问题。该协议定义了明确的状态空间、动作空间和终止条件，具有较强的可复用性。</w:t>
       </w:r>
     </w:p>
     <w:p>
@@ -2559,7 +4044,7 @@
           <w:b w:val="0"/>
           <w:sz w:val="24"/>
         </w:rPr>
-        <w:t>3.  代码知识图谱增强的修复流程：通过 AST 构建动态 KG，为各子智能体提供结构化的代码上下文。</w:t>
+        <w:t>3.  代码知识图谱增强的修复流程：通过 AST 构建动态 KG，为各子智能体提供结构化的代码上下文。KG 不仅支持故障定位和补丁生成，还能在迭代过程中动态更新，反映代码变化。</w:t>
       </w:r>
     </w:p>
     <w:p>
@@ -2574,7 +4059,22 @@
           <w:b w:val="0"/>
           <w:sz w:val="24"/>
         </w:rPr>
-        <w:t>4.  QuixBugs 系统评估：实验表明 MACR 在 QuixBugs 上达到 55% 的修复率，并通过消融实验验证了多智能体分工与 KG 的有效性。</w:t>
+        <w:t>4.  QuixBugs 系统评估：实验表明 MACR 在 QuixBugs 上达到 55% 的修复率，并通过消融实验验证了多智能体分工与 KG 的有效性。详细的失败模式分析为后续研究提供了方向。</w:t>
+      </w:r>
+    </w:p>
+    <w:p>
+      <w:pPr>
+        <w:spacing w:line="360" w:lineRule="auto" w:after="120" w:before="0"/>
+        <w:ind w:firstLine="420"/>
+        <w:jc w:val="left"/>
+      </w:pPr>
+      <w:r>
+        <w:rPr>
+          <w:rFonts w:ascii="宋体" w:hAnsi="宋体" w:eastAsia="宋体"/>
+          <w:b w:val="0"/>
+          <w:sz w:val="24"/>
+        </w:rPr>
+        <w:t>此外，论文还将贡献一个开源的 MACR 原型系统，包括代码、实验脚本和预训练模型接口，以便其他研究者复现和扩展。</w:t>
       </w:r>
     </w:p>
     <w:p>
@@ -2619,7 +4119,7 @@
           <w:b w:val="0"/>
           <w:sz w:val="24"/>
         </w:rPr>
-        <w:t>章节              内容                             进度</w:t>
+        <w:t>在论文写作过程中，我们特别注重以下几个方面：</w:t>
       </w:r>
     </w:p>
     <w:p>
@@ -2634,7 +4134,7 @@
           <w:b w:val="0"/>
           <w:sz w:val="24"/>
         </w:rPr>
-        <w:t>----------------- -------------------------------- --------</w:t>
+        <w:t>-   技术新颖性：突出 MACR 与现有 APR 方法的区别，特别是多智能体协同和 KG 增强的结合。</w:t>
       </w:r>
     </w:p>
     <w:p>
@@ -2649,7 +4149,7 @@
           <w:b w:val="0"/>
           <w:sz w:val="24"/>
         </w:rPr>
-        <w:t>1. Introduction   研究背景、问题、贡献             已完成</w:t>
+        <w:t>-   实验严谨性：通过消融实验、对比实验和失败模式分析，全面评估 MACR 的有效性和局限性。</w:t>
       </w:r>
     </w:p>
     <w:p>
@@ -2664,172 +4164,7 @@
           <w:b w:val="0"/>
           <w:sz w:val="24"/>
         </w:rPr>
-        <w:t>2. Background     APR 与 MAS 基础                  已完成</w:t>
-      </w:r>
-    </w:p>
-    <w:p>
-      <w:pPr>
-        <w:spacing w:line="360" w:lineRule="auto" w:after="120" w:before="0"/>
-        <w:ind w:firstLine="420"/>
-        <w:jc w:val="left"/>
-      </w:pPr>
-      <w:r>
-        <w:rPr>
-          <w:rFonts w:ascii="宋体" w:hAnsi="宋体" w:eastAsia="宋体"/>
-          <w:b w:val="0"/>
-          <w:sz w:val="24"/>
-        </w:rPr>
-        <w:t>3. Related Work   传统 APR、LLM APR、Agentic APR   已完成</w:t>
-      </w:r>
-    </w:p>
-    <w:p>
-      <w:pPr>
-        <w:spacing w:line="360" w:lineRule="auto" w:after="120" w:before="0"/>
-        <w:ind w:firstLine="420"/>
-        <w:jc w:val="left"/>
-      </w:pPr>
-      <w:r>
-        <w:rPr>
-          <w:rFonts w:ascii="宋体" w:hAnsi="宋体" w:eastAsia="宋体"/>
-          <w:b w:val="0"/>
-          <w:sz w:val="24"/>
-        </w:rPr>
-        <w:t>4. Methodology    MACR 框架详细设计                已完成</w:t>
-      </w:r>
-    </w:p>
-    <w:p>
-      <w:pPr>
-        <w:spacing w:line="360" w:lineRule="auto" w:after="120" w:before="0"/>
-        <w:ind w:firstLine="420"/>
-        <w:jc w:val="left"/>
-      </w:pPr>
-      <w:r>
-        <w:rPr>
-          <w:rFonts w:ascii="宋体" w:hAnsi="宋体" w:eastAsia="宋体"/>
-          <w:b w:val="0"/>
-          <w:sz w:val="24"/>
-        </w:rPr>
-        <w:t>5. Evaluation     QuixBugs 实验与消融分析          已完成</w:t>
-      </w:r>
-    </w:p>
-    <w:p>
-      <w:pPr>
-        <w:spacing w:line="360" w:lineRule="auto" w:after="120" w:before="0"/>
-        <w:ind w:firstLine="420"/>
-        <w:jc w:val="left"/>
-      </w:pPr>
-      <w:r>
-        <w:rPr>
-          <w:rFonts w:ascii="宋体" w:hAnsi="宋体" w:eastAsia="宋体"/>
-          <w:b w:val="0"/>
-          <w:sz w:val="24"/>
-        </w:rPr>
-        <w:t>6. Discussion     失败模式、局限与未来工作         初稿</w:t>
-      </w:r>
-    </w:p>
-    <w:p>
-      <w:pPr>
-        <w:spacing w:line="360" w:lineRule="auto" w:after="120" w:before="0"/>
-        <w:ind w:firstLine="420"/>
-        <w:jc w:val="left"/>
-      </w:pPr>
-      <w:r>
-        <w:rPr>
-          <w:rFonts w:ascii="宋体" w:hAnsi="宋体" w:eastAsia="宋体"/>
-          <w:b w:val="0"/>
-          <w:sz w:val="24"/>
-        </w:rPr>
-        <w:t>7. Conclusion     总结                             初稿</w:t>
-      </w:r>
-    </w:p>
-    <w:p>
-      <w:pPr>
-        <w:spacing w:line="360" w:lineRule="auto" w:after="120" w:before="0"/>
-        <w:ind w:firstLine="420"/>
-        <w:jc w:val="left"/>
-      </w:pPr>
-      <w:r>
-        <w:rPr>
-          <w:rFonts w:ascii="宋体" w:hAnsi="宋体" w:eastAsia="宋体"/>
-          <w:b w:val="0"/>
-          <w:sz w:val="24"/>
-        </w:rPr>
-        <w:t>: 论文各章节进度 {#tab:paper-progress}</w:t>
-      </w:r>
-    </w:p>
-    <w:p>
-      <w:pPr>
-        <w:spacing w:line="360" w:lineRule="auto" w:after="120" w:before="0"/>
-        <w:ind w:firstLine="420"/>
-        <w:jc w:val="left"/>
-      </w:pPr>
-      <w:r>
-        <w:rPr>
-          <w:rFonts w:ascii="宋体" w:hAnsi="宋体" w:eastAsia="宋体"/>
-          <w:b w:val="0"/>
-          <w:sz w:val="24"/>
-        </w:rPr>
-        <w:t>会议        截稿日期（预计）   投稿计划</w:t>
-      </w:r>
-    </w:p>
-    <w:p>
-      <w:pPr>
-        <w:spacing w:line="360" w:lineRule="auto" w:after="120" w:before="0"/>
-        <w:ind w:firstLine="420"/>
-        <w:jc w:val="left"/>
-      </w:pPr>
-      <w:r>
-        <w:rPr>
-          <w:rFonts w:ascii="宋体" w:hAnsi="宋体" w:eastAsia="宋体"/>
-          <w:b w:val="0"/>
-          <w:sz w:val="24"/>
-        </w:rPr>
-        <w:t>----------- ------------------ ----------</w:t>
-      </w:r>
-    </w:p>
-    <w:p>
-      <w:pPr>
-        <w:spacing w:line="360" w:lineRule="auto" w:after="120" w:before="0"/>
-        <w:ind w:firstLine="420"/>
-        <w:jc w:val="left"/>
-      </w:pPr>
-      <w:r>
-        <w:rPr>
-          <w:rFonts w:ascii="宋体" w:hAnsi="宋体" w:eastAsia="宋体"/>
-          <w:b w:val="0"/>
-          <w:sz w:val="24"/>
-        </w:rPr>
-        <w:t>ICSE 2026   2025 年 12 月      目标投稿</w:t>
-      </w:r>
-    </w:p>
-    <w:p>
-      <w:pPr>
-        <w:spacing w:line="360" w:lineRule="auto" w:after="120" w:before="0"/>
-        <w:ind w:firstLine="420"/>
-        <w:jc w:val="left"/>
-      </w:pPr>
-      <w:r>
-        <w:rPr>
-          <w:rFonts w:ascii="宋体" w:hAnsi="宋体" w:eastAsia="宋体"/>
-          <w:b w:val="0"/>
-          <w:sz w:val="24"/>
-        </w:rPr>
-        <w:t>FSE 2026    2026 年 2 月       备选投稿</w:t>
-      </w:r>
-    </w:p>
-    <w:p>
-      <w:pPr>
-        <w:spacing w:line="360" w:lineRule="auto" w:after="120" w:before="0"/>
-        <w:ind w:firstLine="420"/>
-        <w:jc w:val="left"/>
-      </w:pPr>
-      <w:r>
-        <w:rPr>
-          <w:rFonts w:ascii="宋体" w:hAnsi="宋体" w:eastAsia="宋体"/>
-          <w:b w:val="0"/>
-          <w:sz w:val="24"/>
-        </w:rPr>
-        <w:t>: 目标会议投稿计划 {#tab:submission-plan}</w:t>
+        <w:t>-   可复现性：提供完整的实验设置、超参数和代码链接，便于审稿人和其他研究者验证。</w:t>
       </w:r>
     </w:p>
     <w:p>
@@ -2864,7 +4199,112 @@
     </w:p>
     <w:p>
       <w:pPr>
-        <w:spacing w:line="360" w:lineRule="auto" w:after="120" w:before="160"/>
+        <w:spacing w:line="360" w:lineRule="auto" w:after="120" w:before="0"/>
+        <w:ind w:firstLine="420"/>
+        <w:jc w:val="left"/>
+      </w:pPr>
+      <w:r>
+        <w:rPr>
+          <w:rFonts w:ascii="宋体" w:hAnsi="宋体" w:eastAsia="宋体"/>
+          <w:b w:val="0"/>
+          <w:sz w:val="24"/>
+        </w:rPr>
+        <w:t>具体支撑成果包括：</w:t>
+      </w:r>
+    </w:p>
+    <w:p>
+      <w:pPr>
+        <w:spacing w:line="360" w:lineRule="auto" w:after="120" w:before="0"/>
+        <w:ind w:firstLine="420"/>
+        <w:jc w:val="left"/>
+      </w:pPr>
+      <w:r>
+        <w:rPr>
+          <w:rFonts w:ascii="宋体" w:hAnsi="宋体" w:eastAsia="宋体"/>
+          <w:b w:val="0"/>
+          <w:sz w:val="24"/>
+        </w:rPr>
+        <w:t>-   MACR 原型系统：包含协调器、6 个子智能体、KG 构建模块和验证模块，支持 QuixBugs 数据集的端到端修复。</w:t>
+      </w:r>
+    </w:p>
+    <w:p>
+      <w:pPr>
+        <w:spacing w:line="360" w:lineRule="auto" w:after="120" w:before="0"/>
+        <w:ind w:firstLine="420"/>
+        <w:jc w:val="left"/>
+      </w:pPr>
+      <w:r>
+        <w:rPr>
+          <w:rFonts w:ascii="宋体" w:hAnsi="宋体" w:eastAsia="宋体"/>
+          <w:b w:val="0"/>
+          <w:sz w:val="24"/>
+        </w:rPr>
+        <w:t>-   实验数据集：已完成 QuixBugs 的适配和预处理，Defects4J 的预处理脚本已就绪。</w:t>
+      </w:r>
+    </w:p>
+    <w:p>
+      <w:pPr>
+        <w:spacing w:line="360" w:lineRule="auto" w:after="120" w:before="0"/>
+        <w:ind w:firstLine="420"/>
+        <w:jc w:val="left"/>
+      </w:pPr>
+      <w:r>
+        <w:rPr>
+          <w:rFonts w:ascii="宋体" w:hAnsi="宋体" w:eastAsia="宋体"/>
+          <w:b w:val="0"/>
+          <w:sz w:val="24"/>
+        </w:rPr>
+        <w:t>-   图表工具：开发了 4 张报告专用图表和 3 张论文专用图表，支持自动生成 PDF。</w:t>
+      </w:r>
+    </w:p>
+    <w:p>
+      <w:pPr>
+        <w:spacing w:line="360" w:lineRule="auto" w:after="120" w:before="0"/>
+        <w:ind w:firstLine="420"/>
+        <w:jc w:val="left"/>
+      </w:pPr>
+      <w:r>
+        <w:rPr>
+          <w:rFonts w:ascii="宋体" w:hAnsi="宋体" w:eastAsia="宋体"/>
+          <w:b w:val="0"/>
+          <w:sz w:val="24"/>
+        </w:rPr>
+        <w:t>-   构建系统：基于 Makefile 和 pandoc 的一键构建系统，可生成 IEEE、ACM、ACL 和中文报告四种格式的 PDF。</w:t>
+      </w:r>
+    </w:p>
+    <w:p>
+      <w:pPr>
+        <w:spacing w:line="360" w:lineRule="auto" w:after="120" w:before="0"/>
+        <w:ind w:firstLine="420"/>
+        <w:jc w:val="left"/>
+      </w:pPr>
+      <w:r>
+        <w:rPr>
+          <w:rFonts w:ascii="宋体" w:hAnsi="宋体" w:eastAsia="宋体"/>
+          <w:b w:val="0"/>
+          <w:sz w:val="24"/>
+        </w:rPr>
+        <w:t>这些成果不仅为论文撰写提供了坚实基础，也为后续在更大数据集上的扩展评估奠定了条件。</w:t>
+      </w:r>
+    </w:p>
+    <w:p>
+      <w:pPr>
+        <w:spacing w:line="360" w:lineRule="auto" w:after="120" w:before="0"/>
+        <w:ind w:firstLine="420"/>
+        <w:jc w:val="left"/>
+      </w:pPr>
+      <w:r>
+        <w:rPr>
+          <w:rFonts w:ascii="宋体" w:hAnsi="宋体" w:eastAsia="宋体"/>
+          <w:b w:val="0"/>
+          <w:sz w:val="24"/>
+        </w:rPr>
+        <w:t>五、下一步研究计划与论文工作计划</w:t>
+      </w:r>
+    </w:p>
+    <w:p>
+      <w:pPr>
+        <w:spacing w:line="360" w:lineRule="auto" w:after="120" w:before="80"/>
         <w:ind w:firstLine="420"/>
         <w:jc w:val="left"/>
       </w:pPr>
@@ -2874,7 +4314,7 @@
           <w:b/>
           <w:sz w:val="24"/>
         </w:rPr>
-        <w:t>4 下一步研究计划及论文工作计划</w:t>
+        <w:t>3.1 技术路线</w:t>
       </w:r>
     </w:p>
     <w:p>
@@ -2889,22 +4329,7 @@
           <w:b/>
           <w:sz w:val="24"/>
         </w:rPr>
-        <w:t>4.1 技术路线</w:t>
-      </w:r>
-    </w:p>
-    <w:p>
-      <w:pPr>
-        <w:spacing w:line="360" w:lineRule="auto" w:after="120" w:before="80"/>
-        <w:ind w:firstLine="420"/>
-        <w:jc w:val="left"/>
-      </w:pPr>
-      <w:r>
-        <w:rPr>
-          <w:rFonts w:ascii="宋体" w:hAnsi="宋体" w:eastAsia="宋体"/>
-          <w:b/>
-          <w:sz w:val="24"/>
-        </w:rPr>
-        <w:t>4.1.1 提升修复能力</w:t>
+        <w:t>3.1.1 提升修复能力</w:t>
       </w:r>
     </w:p>
     <w:p>
@@ -2934,7 +4359,7 @@
           <w:b w:val="0"/>
           <w:sz w:val="24"/>
         </w:rPr>
-        <w:t>1.  跨文件缺陷修复：扩展 KG 的构建范围，支持多文件、跨模块依赖分析，以处理 Defects4J 等更真实的数据集 [1]。</w:t>
+        <w:t>1.  跨文件缺陷修复：扩展 KG 的构建范围，支持多文件、跨模块依赖分析，以处理 Defects4J 等更真实的数据集 [26]。QuixBugs 中的缺陷多为单文件、局部逻辑错误，而 Defects4J 中的缺陷往往涉及多个文件和复杂的业务逻辑。为此，我们需要：</w:t>
       </w:r>
     </w:p>
     <w:p>
@@ -2949,7 +4374,7 @@
           <w:b w:val="0"/>
           <w:sz w:val="24"/>
         </w:rPr>
-        <w:t>2.  强化反馈机制：引入更细粒度的测试失败定位与补丁差异分析，提升 Diagnosis Agent 的建议质量。</w:t>
+        <w:t>-   改进 KG 构建算法，支持项目级依赖分析，包括包导入、类继承和跨文件函数调用。</w:t>
       </w:r>
     </w:p>
     <w:p>
@@ -2964,7 +4389,7 @@
           <w:b w:val="0"/>
           <w:sz w:val="24"/>
         </w:rPr>
-        <w:t>3.  智能采样策略：结合 RepairAgent 与 SWE-agent 的工具调用思想，在生成前主动检索相关文件与文档，减少上下文不足导致的失败 [2], [3]。</w:t>
+        <w:t>-   开发上下文选择策略，在生成补丁时自动检索相关文件和函数。</w:t>
       </w:r>
     </w:p>
     <w:p>
@@ -2979,7 +4404,142 @@
           <w:b w:val="0"/>
           <w:sz w:val="24"/>
         </w:rPr>
-        <w:t>4.  模型能力提升：探索 DeepSeek-Coder-V2 等更强大的代码模型在 MACR 框架下的表现 [4]。</w:t>
+        <w:t>-   设计针对 Java 语言的 AST 解析和 KG 表示方案。</w:t>
+      </w:r>
+    </w:p>
+    <w:p>
+      <w:pPr>
+        <w:spacing w:line="360" w:lineRule="auto" w:after="120" w:before="0"/>
+        <w:ind w:firstLine="420"/>
+        <w:jc w:val="left"/>
+      </w:pPr>
+      <w:r>
+        <w:rPr>
+          <w:rFonts w:ascii="宋体" w:hAnsi="宋体" w:eastAsia="宋体"/>
+          <w:b w:val="0"/>
+          <w:sz w:val="24"/>
+        </w:rPr>
+        <w:t>2.  强化反馈机制：引入更细粒度的测试失败定位与补丁差异分析，提升 Diagnosis Agent 的建议质量。具体措施包括：</w:t>
+      </w:r>
+    </w:p>
+    <w:p>
+      <w:pPr>
+        <w:spacing w:line="360" w:lineRule="auto" w:after="120" w:before="0"/>
+        <w:ind w:firstLine="420"/>
+        <w:jc w:val="left"/>
+      </w:pPr>
+      <w:r>
+        <w:rPr>
+          <w:rFonts w:ascii="宋体" w:hAnsi="宋体" w:eastAsia="宋体"/>
+          <w:b w:val="0"/>
+          <w:sz w:val="24"/>
+        </w:rPr>
+        <w:t>-   使用切片技术定位失败测试中受补丁影响的关键语句。</w:t>
+      </w:r>
+    </w:p>
+    <w:p>
+      <w:pPr>
+        <w:spacing w:line="360" w:lineRule="auto" w:after="120" w:before="0"/>
+        <w:ind w:firstLine="420"/>
+        <w:jc w:val="left"/>
+      </w:pPr>
+      <w:r>
+        <w:rPr>
+          <w:rFonts w:ascii="宋体" w:hAnsi="宋体" w:eastAsia="宋体"/>
+          <w:b w:val="0"/>
+          <w:sz w:val="24"/>
+        </w:rPr>
+        <w:t>-   对比正确执行与失败执行的轨迹差异，生成更准确的诊断报告。</w:t>
+      </w:r>
+    </w:p>
+    <w:p>
+      <w:pPr>
+        <w:spacing w:line="360" w:lineRule="auto" w:after="120" w:before="0"/>
+        <w:ind w:firstLine="420"/>
+        <w:jc w:val="left"/>
+      </w:pPr>
+      <w:r>
+        <w:rPr>
+          <w:rFonts w:ascii="宋体" w:hAnsi="宋体" w:eastAsia="宋体"/>
+          <w:b w:val="0"/>
+          <w:sz w:val="24"/>
+        </w:rPr>
+        <w:t>-   将诊断信息编码为结构化模板，便于生成智能体直接利用。</w:t>
+      </w:r>
+    </w:p>
+    <w:p>
+      <w:pPr>
+        <w:spacing w:line="360" w:lineRule="auto" w:after="120" w:before="0"/>
+        <w:ind w:firstLine="420"/>
+        <w:jc w:val="left"/>
+      </w:pPr>
+      <w:r>
+        <w:rPr>
+          <w:rFonts w:ascii="宋体" w:hAnsi="宋体" w:eastAsia="宋体"/>
+          <w:b w:val="0"/>
+          <w:sz w:val="24"/>
+        </w:rPr>
+        <w:t>3.  智能采样策略：结合 RepairAgent 与 SWE-agent 的工具调用思想，在生成前主动检索相关文件与文档，减少上下文不足导致的失败 [8], [9]。我们计划实现以下工具：</w:t>
+      </w:r>
+    </w:p>
+    <w:p>
+      <w:pPr>
+        <w:spacing w:line="360" w:lineRule="auto" w:after="120" w:before="0"/>
+        <w:ind w:firstLine="420"/>
+        <w:jc w:val="left"/>
+      </w:pPr>
+      <w:r>
+        <w:rPr>
+          <w:rFonts w:ascii="宋体" w:hAnsi="宋体" w:eastAsia="宋体"/>
+          <w:b w:val="0"/>
+          <w:sz w:val="24"/>
+        </w:rPr>
+        <w:t>-   代码搜索工具：根据关键词或失败信息搜索相关代码片段。</w:t>
+      </w:r>
+    </w:p>
+    <w:p>
+      <w:pPr>
+        <w:spacing w:line="360" w:lineRule="auto" w:after="120" w:before="0"/>
+        <w:ind w:firstLine="420"/>
+        <w:jc w:val="left"/>
+      </w:pPr>
+      <w:r>
+        <w:rPr>
+          <w:rFonts w:ascii="宋体" w:hAnsi="宋体" w:eastAsia="宋体"/>
+          <w:b w:val="0"/>
+          <w:sz w:val="24"/>
+        </w:rPr>
+        <w:t>-   文档检索工具：从 README、API 文档和代码注释中获取上下文。</w:t>
+      </w:r>
+    </w:p>
+    <w:p>
+      <w:pPr>
+        <w:spacing w:line="360" w:lineRule="auto" w:after="120" w:before="0"/>
+        <w:ind w:firstLine="420"/>
+        <w:jc w:val="left"/>
+      </w:pPr>
+      <w:r>
+        <w:rPr>
+          <w:rFonts w:ascii="宋体" w:hAnsi="宋体" w:eastAsia="宋体"/>
+          <w:b w:val="0"/>
+          <w:sz w:val="24"/>
+        </w:rPr>
+        <w:t>-   版本历史工具：分析 git 历史以发现类似修复模式。</w:t>
+      </w:r>
+    </w:p>
+    <w:p>
+      <w:pPr>
+        <w:spacing w:line="360" w:lineRule="auto" w:after="120" w:before="0"/>
+        <w:ind w:firstLine="420"/>
+        <w:jc w:val="left"/>
+      </w:pPr>
+      <w:r>
+        <w:rPr>
+          <w:rFonts w:ascii="宋体" w:hAnsi="宋体" w:eastAsia="宋体"/>
+          <w:b w:val="0"/>
+          <w:sz w:val="24"/>
+        </w:rPr>
+        <w:t>4.  模型能力提升：探索 DeepSeek-Coder-V2 等更强大的代码模型在 MACR 框架下的表现 [24]。我们将对比不同模型在相同任务上的修复率、成本和迭代次数，并分析模型规模与修复能力的关系。</w:t>
       </w:r>
     </w:p>
     <w:p>
@@ -2994,7 +4554,7 @@
           <w:b/>
           <w:sz w:val="24"/>
         </w:rPr>
-        <w:t>4.1.2 多智能体协同机制优化</w:t>
+        <w:t>3.1.2 多智能体协同机制优化</w:t>
       </w:r>
     </w:p>
     <w:p>
@@ -3009,7 +4569,7 @@
           <w:b w:val="0"/>
           <w:sz w:val="24"/>
         </w:rPr>
-        <w:t>针对 Cemri 等人揭示的多智能体失败模式 [5]，MACR 将重点优化以下方面：</w:t>
+        <w:t>针对 Cemri 等人揭示的多智能体失败模式 [19]，MACR 将重点优化以下方面：</w:t>
       </w:r>
     </w:p>
     <w:p>
@@ -3024,7 +4584,7 @@
           <w:b w:val="0"/>
           <w:sz w:val="24"/>
         </w:rPr>
-        <w:t>-   任务规范强化：在协调器中为每个子智能体设定更明确的输入输出规范与终止条件。</w:t>
+        <w:t>-   任务规范强化：在协调器中为每个子智能体设定更明确的输入输出规范与终止条件。我们将为每个智能体编写详细的角色描述和示例提示，减少任务理解偏差。</w:t>
       </w:r>
     </w:p>
     <w:p>
@@ -3039,7 +4599,7 @@
           <w:b w:val="0"/>
           <w:sz w:val="24"/>
         </w:rPr>
-        <w:t>-   智能体对齐机制：引入交叉检查（cross-verification）与一致性约束，减少智能体间信息偏差。</w:t>
+        <w:t>-   智能体对齐机制：引入交叉检查（cross-verification）与一致性约束，减少智能体间信息偏差。例如，Patch Generation Agent 生成的补丁可由一个独立的 Review Agent 进行初步审查，验证其是否符合代码风格和语义约束。</w:t>
       </w:r>
     </w:p>
     <w:p>
@@ -3054,7 +4614,22 @@
           <w:b w:val="0"/>
           <w:sz w:val="24"/>
         </w:rPr>
-        <w:t>-   动态角色调整：借鉴 AgentDropout 的自适应智能体选择策略 [6]，根据问题复杂度动态增减参与修复的智能体数量。</w:t>
+        <w:t>-   动态角色调整：借鉴 AgentDropout 的自适应智能体选择策略 [22]，根据问题复杂度动态增减参与修复的智能体数量。对于简单缺陷，可减少智能体数量以降低成本；对于复杂缺陷，可增加 Review Agent 和 Test Generation Agent 以提高成功率。</w:t>
+      </w:r>
+    </w:p>
+    <w:p>
+      <w:pPr>
+        <w:spacing w:line="360" w:lineRule="auto" w:after="120" w:before="0"/>
+        <w:ind w:firstLine="420"/>
+        <w:jc w:val="left"/>
+      </w:pPr>
+      <w:r>
+        <w:rPr>
+          <w:rFonts w:ascii="宋体" w:hAnsi="宋体" w:eastAsia="宋体"/>
+          <w:b w:val="0"/>
+          <w:sz w:val="24"/>
+        </w:rPr>
+        <w:t>-   通信效率优化：当前协调器采用集中式通信，所有信息通过协调器中转。我们将探索更高效的通信模式，如直接智能体间通信和共享记忆机制，以减少重复信息传递。</w:t>
       </w:r>
     </w:p>
     <w:p>
@@ -3069,7 +4644,7 @@
           <w:b/>
           <w:sz w:val="24"/>
         </w:rPr>
-        <w:t>4.1.3 知识图谱扩展</w:t>
+        <w:t>3.1.3 知识图谱扩展</w:t>
       </w:r>
     </w:p>
     <w:p>
@@ -3099,7 +4674,7 @@
           <w:b w:val="0"/>
           <w:sz w:val="24"/>
         </w:rPr>
-        <w:t>-   引入程序依赖图（PDG）与控制流图（CFG）信息，丰富 KG 的语义表达能力。</w:t>
+        <w:t>-   引入程序依赖图（PDG）与控制流图（CFG）信息，丰富 KG 的语义表达能力。PDG 能够表示数据依赖和控制依赖，有助于理解缺陷的传播路径；CFG 能够表示执行路径，有助于分析测试覆盖和边界条件。</w:t>
       </w:r>
     </w:p>
     <w:p>
@@ -3114,7 +4689,7 @@
           <w:b w:val="0"/>
           <w:sz w:val="24"/>
         </w:rPr>
-        <w:t>-   探索 KG 与检索增强生成（RAG）的结合，将外部 API 文档与项目特定知识纳入上下文。</w:t>
+        <w:t>-   探索 KG 与检索增强生成（RAG）的结合，将外部 API 文档与项目特定知识纳入上下文。例如，当缺陷涉及某个库函数时，可从官方文档中检索该函数的用法和常见错误。</w:t>
       </w:r>
     </w:p>
     <w:p>
@@ -3129,7 +4704,22 @@
           <w:b w:val="0"/>
           <w:sz w:val="24"/>
         </w:rPr>
-        <w:t>-   研究 KG 的增量更新策略，在补丁生成过程中动态反映代码变化。</w:t>
+        <w:t>-   研究 KG 的增量更新策略，在补丁生成过程中动态反映代码变化。当前 KG 在每个修复轮次重新构建，效率较低。我们将开发增量更新算法，仅更新受补丁影响的节点和关系。</w:t>
+      </w:r>
+    </w:p>
+    <w:p>
+      <w:pPr>
+        <w:spacing w:line="360" w:lineRule="auto" w:after="120" w:before="0"/>
+        <w:ind w:firstLine="420"/>
+        <w:jc w:val="left"/>
+      </w:pPr>
+      <w:r>
+        <w:rPr>
+          <w:rFonts w:ascii="宋体" w:hAnsi="宋体" w:eastAsia="宋体"/>
+          <w:b w:val="0"/>
+          <w:sz w:val="24"/>
+        </w:rPr>
+        <w:t>-   引入图神经网络（GNN）对 KG 进行嵌入学习，使智能体能够利用图结构进行更精确的推理和候选选择。</w:t>
       </w:r>
     </w:p>
     <w:p>
@@ -3144,7 +4734,7 @@
           <w:b/>
           <w:sz w:val="24"/>
         </w:rPr>
-        <w:t>4.2 论文工作计划</w:t>
+        <w:t>3.2 论文工作计划</w:t>
       </w:r>
     </w:p>
     <w:p>
@@ -3159,7 +4749,7 @@
           <w:b w:val="0"/>
           <w:sz w:val="24"/>
         </w:rPr>
-        <w:t>时间节点        任务                  预期产出</w:t>
+        <w:t>除主会投稿外，我们还计划将 MACR 的部分技术模块投稿至相关 workshop，例如：</w:t>
       </w:r>
     </w:p>
     <w:p>
@@ -3174,7 +4764,7 @@
           <w:b w:val="0"/>
           <w:sz w:val="24"/>
         </w:rPr>
-        <w:t>--------------- --------------------- --------------</w:t>
+        <w:t>-   LLM4Code Workshop @ ICSE 2026：聚焦 LLM 在代码任务中的应用，适合展示 MACR 的 LLM-based 修复机制。</w:t>
       </w:r>
     </w:p>
     <w:p>
@@ -3189,82 +4779,7 @@
           <w:b w:val="0"/>
           <w:sz w:val="24"/>
         </w:rPr>
-        <w:t>2025 年 7 月    完成论文初稿          完整论文手稿</w:t>
-      </w:r>
-    </w:p>
-    <w:p>
-      <w:pPr>
-        <w:spacing w:line="360" w:lineRule="auto" w:after="120" w:before="0"/>
-        <w:ind w:firstLine="420"/>
-        <w:jc w:val="left"/>
-      </w:pPr>
-      <w:r>
-        <w:rPr>
-          <w:rFonts w:ascii="宋体" w:hAnsi="宋体" w:eastAsia="宋体"/>
-          <w:b w:val="0"/>
-          <w:sz w:val="24"/>
-        </w:rPr>
-        <w:t>2025 年 8 月    内部审稿与修改        修改后论文</w:t>
-      </w:r>
-    </w:p>
-    <w:p>
-      <w:pPr>
-        <w:spacing w:line="360" w:lineRule="auto" w:after="120" w:before="0"/>
-        <w:ind w:firstLine="420"/>
-        <w:jc w:val="left"/>
-      </w:pPr>
-      <w:r>
-        <w:rPr>
-          <w:rFonts w:ascii="宋体" w:hAnsi="宋体" w:eastAsia="宋体"/>
-          <w:b w:val="0"/>
-          <w:sz w:val="24"/>
-        </w:rPr>
-        <w:t>2025 年 9 月    补充 Defects4J 实验   扩展实验结果</w:t>
-      </w:r>
-    </w:p>
-    <w:p>
-      <w:pPr>
-        <w:spacing w:line="360" w:lineRule="auto" w:after="120" w:before="0"/>
-        <w:ind w:firstLine="420"/>
-        <w:jc w:val="left"/>
-      </w:pPr>
-      <w:r>
-        <w:rPr>
-          <w:rFonts w:ascii="宋体" w:hAnsi="宋体" w:eastAsia="宋体"/>
-          <w:b w:val="0"/>
-          <w:sz w:val="24"/>
-        </w:rPr>
-        <w:t>2025 年 10 月   论文精修与格式调整    投稿版本</w:t>
-      </w:r>
-    </w:p>
-    <w:p>
-      <w:pPr>
-        <w:spacing w:line="360" w:lineRule="auto" w:after="120" w:before="0"/>
-        <w:ind w:firstLine="420"/>
-        <w:jc w:val="left"/>
-      </w:pPr>
-      <w:r>
-        <w:rPr>
-          <w:rFonts w:ascii="宋体" w:hAnsi="宋体" w:eastAsia="宋体"/>
-          <w:b w:val="0"/>
-          <w:sz w:val="24"/>
-        </w:rPr>
-        <w:t>2025 年 12 月   投稿 ICSE 2026        投稿确认</w:t>
-      </w:r>
-    </w:p>
-    <w:p>
-      <w:pPr>
-        <w:spacing w:line="360" w:lineRule="auto" w:after="120" w:before="0"/>
-        <w:ind w:firstLine="420"/>
-        <w:jc w:val="left"/>
-      </w:pPr>
-      <w:r>
-        <w:rPr>
-          <w:rFonts w:ascii="宋体" w:hAnsi="宋体" w:eastAsia="宋体"/>
-          <w:b w:val="0"/>
-          <w:sz w:val="24"/>
-        </w:rPr>
-        <w:t>: 下一步工作计划 {#tab:plan}</w:t>
+        <w:t>-   AIware Workshop @ FSE 2026：关注 AI 驱动的软件工程系统，适合讨论 MACR 的多智能体架构设计。</w:t>
       </w:r>
     </w:p>
     <w:p>
@@ -3279,127 +4794,7 @@
           <w:b/>
           <w:sz w:val="24"/>
         </w:rPr>
-        <w:t>4.3 风险评估与应对措施</w:t>
-      </w:r>
-    </w:p>
-    <w:p>
-      <w:pPr>
-        <w:spacing w:line="360" w:lineRule="auto" w:after="120" w:before="0"/>
-        <w:ind w:firstLine="420"/>
-        <w:jc w:val="left"/>
-      </w:pPr>
-      <w:r>
-        <w:rPr>
-          <w:rFonts w:ascii="宋体" w:hAnsi="宋体" w:eastAsia="宋体"/>
-          <w:b w:val="0"/>
-          <w:sz w:val="24"/>
-        </w:rPr>
-        <w:t>----------------------------------------------------------------------------------</w:t>
-      </w:r>
-    </w:p>
-    <w:p>
-      <w:pPr>
-        <w:spacing w:line="360" w:lineRule="auto" w:after="120" w:before="0"/>
-        <w:ind w:firstLine="420"/>
-        <w:jc w:val="left"/>
-      </w:pPr>
-      <w:r>
-        <w:rPr>
-          <w:rFonts w:ascii="宋体" w:hAnsi="宋体" w:eastAsia="宋体"/>
-          <w:b w:val="0"/>
-          <w:sz w:val="24"/>
-        </w:rPr>
-        <w:t>风险                     影响                 应对措施</w:t>
-      </w:r>
-    </w:p>
-    <w:p>
-      <w:pPr>
-        <w:spacing w:line="360" w:lineRule="auto" w:after="120" w:before="0"/>
-        <w:ind w:firstLine="420"/>
-        <w:jc w:val="left"/>
-      </w:pPr>
-      <w:r>
-        <w:rPr>
-          <w:rFonts w:ascii="宋体" w:hAnsi="宋体" w:eastAsia="宋体"/>
-          <w:b w:val="0"/>
-          <w:sz w:val="24"/>
-        </w:rPr>
-        <w:t>------------------------ -------------------- ------------------------------------</w:t>
-      </w:r>
-    </w:p>
-    <w:p>
-      <w:pPr>
-        <w:spacing w:line="360" w:lineRule="auto" w:after="120" w:before="0"/>
-        <w:ind w:firstLine="420"/>
-        <w:jc w:val="left"/>
-      </w:pPr>
-      <w:r>
-        <w:rPr>
-          <w:rFonts w:ascii="宋体" w:hAnsi="宋体" w:eastAsia="宋体"/>
-          <w:b w:val="0"/>
-          <w:sz w:val="24"/>
-        </w:rPr>
-        <w:t>Defects4J 实验成本过高   时间延误             采用分层采样，优先验证高可疑度缺陷</w:t>
-      </w:r>
-    </w:p>
-    <w:p>
-      <w:pPr>
-        <w:spacing w:line="360" w:lineRule="auto" w:after="120" w:before="0"/>
-        <w:ind w:firstLine="420"/>
-        <w:jc w:val="left"/>
-      </w:pPr>
-      <w:r>
-        <w:rPr>
-          <w:rFonts w:ascii="宋体" w:hAnsi="宋体" w:eastAsia="宋体"/>
-          <w:b w:val="0"/>
-          <w:sz w:val="24"/>
-        </w:rPr>
-        <w:t>多智能体通信不稳定       修复率波动           固化协调协议，增加状态检查点</w:t>
-      </w:r>
-    </w:p>
-    <w:p>
-      <w:pPr>
-        <w:spacing w:line="360" w:lineRule="auto" w:after="120" w:before="0"/>
-        <w:ind w:firstLine="420"/>
-        <w:jc w:val="left"/>
-      </w:pPr>
-      <w:r>
-        <w:rPr>
-          <w:rFonts w:ascii="宋体" w:hAnsi="宋体" w:eastAsia="宋体"/>
-          <w:b w:val="0"/>
-          <w:sz w:val="24"/>
-        </w:rPr>
-        <w:t>论文审稿周期长           错过目标会议         同时准备 FSE 2026 等备选会议</w:t>
-      </w:r>
-    </w:p>
-    <w:p>
-      <w:pPr>
-        <w:spacing w:line="360" w:lineRule="auto" w:after="120" w:before="0"/>
-        <w:ind w:firstLine="420"/>
-        <w:jc w:val="left"/>
-      </w:pPr>
-      <w:r>
-        <w:rPr>
-          <w:rFonts w:ascii="宋体" w:hAnsi="宋体" w:eastAsia="宋体"/>
-          <w:b w:val="0"/>
-          <w:sz w:val="24"/>
-        </w:rPr>
-        <w:t>----------------------------------------------------------------------------------</w:t>
-      </w:r>
-    </w:p>
-    <w:p>
-      <w:pPr>
-        <w:spacing w:line="360" w:lineRule="auto" w:after="120" w:before="0"/>
-        <w:ind w:firstLine="420"/>
-        <w:jc w:val="left"/>
-      </w:pPr>
-      <w:r>
-        <w:rPr>
-          <w:rFonts w:ascii="宋体" w:hAnsi="宋体" w:eastAsia="宋体"/>
-          <w:b w:val="0"/>
-          <w:sz w:val="24"/>
-        </w:rPr>
-        <w:t>: 项目风险与应对措施 {#tab:risk}</w:t>
+        <w:t>3.3 风险评估与应对措施</w:t>
       </w:r>
     </w:p>
     <w:p>
@@ -3414,7 +4809,7 @@
           <w:b/>
           <w:sz w:val="24"/>
         </w:rPr>
-        <w:t>4.4 总结</w:t>
+        <w:t>3.4 总结</w:t>
       </w:r>
     </w:p>
     <w:p>
@@ -3444,82 +4839,7 @@
           <w:b w:val="0"/>
           <w:sz w:val="24"/>
         </w:rPr>
-        <w:t>[1] R. Just, D. Jalali, and M. D. Ernst, “Defects4J: A database of existing faults to enable controlled testing studies for java programs,” in Proceedings of the 2014 international symposium on software testing and analysis, San Jose, CA, USA: ACM, 2014, pp. 437–440. doi: 10.1145/2610384.2628055.</w:t>
-      </w:r>
-    </w:p>
-    <w:p>
-      <w:pPr>
-        <w:spacing w:line="360" w:lineRule="auto" w:after="120" w:before="0"/>
-        <w:ind w:firstLine="420"/>
-        <w:jc w:val="left"/>
-      </w:pPr>
-      <w:r>
-        <w:rPr>
-          <w:rFonts w:ascii="宋体" w:hAnsi="宋体" w:eastAsia="宋体"/>
-          <w:b w:val="0"/>
-          <w:sz w:val="24"/>
-        </w:rPr>
-        <w:t>[2] I. Bouzenia, P. Devanbu, and M. Pradel, “RepairAgent: An autonomous, LLM-based agent for program repair.” arXiv, Oct. 28, 2024. doi: 10.48550/arXiv.2403.17134.</w:t>
-      </w:r>
-    </w:p>
-    <w:p>
-      <w:pPr>
-        <w:spacing w:line="360" w:lineRule="auto" w:after="120" w:before="0"/>
-        <w:ind w:firstLine="420"/>
-        <w:jc w:val="left"/>
-      </w:pPr>
-      <w:r>
-        <w:rPr>
-          <w:rFonts w:ascii="宋体" w:hAnsi="宋体" w:eastAsia="宋体"/>
-          <w:b w:val="0"/>
-          <w:sz w:val="24"/>
-        </w:rPr>
-        <w:t>[3] J. Yang et al., “SWE-agent: Agent-computer interfaces enable automated software engineering.” arXiv, Nov. 11, 2024. doi: 10.48550/arXiv.2405.15793.</w:t>
-      </w:r>
-    </w:p>
-    <w:p>
-      <w:pPr>
-        <w:spacing w:line="360" w:lineRule="auto" w:after="120" w:before="0"/>
-        <w:ind w:firstLine="420"/>
-        <w:jc w:val="left"/>
-      </w:pPr>
-      <w:r>
-        <w:rPr>
-          <w:rFonts w:ascii="宋体" w:hAnsi="宋体" w:eastAsia="宋体"/>
-          <w:b w:val="0"/>
-          <w:sz w:val="24"/>
-        </w:rPr>
-        <w:t>[4] DeepSeek-AI et al., “DeepSeek-coder-V2: Breaking the barrier of closed-source models in code intelligence.” arXiv, Jun. 17, 2024. doi: 10.48550/arXiv.2406.11931.</w:t>
-      </w:r>
-    </w:p>
-    <w:p>
-      <w:pPr>
-        <w:spacing w:line="360" w:lineRule="auto" w:after="120" w:before="0"/>
-        <w:ind w:firstLine="420"/>
-        <w:jc w:val="left"/>
-      </w:pPr>
-      <w:r>
-        <w:rPr>
-          <w:rFonts w:ascii="宋体" w:hAnsi="宋体" w:eastAsia="宋体"/>
-          <w:b w:val="0"/>
-          <w:sz w:val="24"/>
-        </w:rPr>
-        <w:t>[5] M. Cemri et al., “Why do multi-agent LLM systems fail?”</w:t>
-      </w:r>
-    </w:p>
-    <w:p>
-      <w:pPr>
-        <w:spacing w:line="360" w:lineRule="auto" w:after="120" w:before="0"/>
-        <w:ind w:firstLine="420"/>
-        <w:jc w:val="left"/>
-      </w:pPr>
-      <w:r>
-        <w:rPr>
-          <w:rFonts w:ascii="宋体" w:hAnsi="宋体" w:eastAsia="宋体"/>
-          <w:b w:val="0"/>
-          <w:sz w:val="24"/>
-        </w:rPr>
-        <w:t>[6] C. Qian et al., “SCALING LARGE LANGUAGE MODEL-BASED MULTI-AGENT COLLABORATION,” 2025.</w:t>
+        <w:t>从长远来看，MACR 的研究不仅限于程序修复，还可扩展至代码审查、测试生成、缺陷预测等更广泛的软件工程任务。通过不断完善多智能体协同机制和知识图谱技术，我们期望为智能化软件开发提供新的方法论和工具支持。</w:t>
       </w:r>
     </w:p>
     <w:p>
@@ -4104,7 +5424,7 @@
           <w:b w:val="0"/>
           <w:sz w:val="21"/>
         </w:rPr>
-        <w:t>[8] Z. Zhang, Y. Wang, C. Wang, J. Chen, and Z. Zheng, “LLM hallucinations in practical code generation: Phenomena, mechanism, and mitigation.” arXiv, Jan. 17, 2025. doi: 10.48550/arXiv.2409.20550.</w:t>
+        <w:t>[8] I. Bouzenia, P. Devanbu, and M. Pradel, “RepairAgent: An autonomous, LLM-based agent for program repair.” arXiv, Oct. 28, 2024. doi: 10.48550/arXiv.2403.17134.</w:t>
       </w:r>
     </w:p>
     <w:p>
@@ -4119,7 +5439,7 @@
           <w:b w:val="0"/>
           <w:sz w:val="21"/>
         </w:rPr>
-        <w:t>[9] P. Xue et al., “Exploring and lifting the robustness of LLM-powered automated program repair with metamorphic testing.” arXiv, Mar. 09, 2025. doi: 10.48550/arXiv.2410.07516.</w:t>
+        <w:t>[9] J. Yang et al., “SWE-agent: Agent-computer interfaces enable automated software engineering.” arXiv, Nov. 11, 2024. doi: 10.48550/arXiv.2405.15793.</w:t>
       </w:r>
     </w:p>
     <w:p>
@@ -4134,7 +5454,7 @@
           <w:b w:val="0"/>
           <w:sz w:val="21"/>
         </w:rPr>
-        <w:t>[10] X. Chen, M. Lin, N. Schärli, and D. Zhou, “Teaching large language models to self-debug.” arXiv, Oct. 05, 2023. doi: 10.48550/arXiv.2304.05128.</w:t>
+        <w:t>[10] X. Wang et al., “OpenHands: An open platform for AI software developers as generalist agents.” arXiv, Apr. 18, 2025. doi: 10.48550/arXiv.2407.16741.</w:t>
       </w:r>
     </w:p>
     <w:p>
@@ -4149,7 +5469,7 @@
           <w:b w:val="0"/>
           <w:sz w:val="21"/>
         </w:rPr>
-        <w:t>[11] J. He, C. Treude, and D. Lo, “LLM-based multi-agent systems for software engineering: Literature review, vision, and the road ahead,” ACM Trans. Softw. Eng. Methodol., vol. 34, no. 5, pp. 124:1–124:30, May 2025, doi: 10.1145/3712003.</w:t>
+        <w:t>[11] Z. Zhang, Y. Wang, C. Wang, J. Chen, and Z. Zheng, “LLM hallucinations in practical code generation: Phenomena, mechanism, and mitigation.” arXiv, Jan. 17, 2025. doi: 10.48550/arXiv.2409.20550.</w:t>
       </w:r>
     </w:p>
     <w:p>
@@ -4164,7 +5484,7 @@
           <w:b w:val="0"/>
           <w:sz w:val="21"/>
         </w:rPr>
-        <w:t>[12] S. Hong et al., “MetaGPT: Meta programming for a multi-agent collaborative framework.” arXiv, Nov. 01, 2024. doi: 10.48550/arXiv.2308.00352.</w:t>
+        <w:t>[12] P. Xue et al., “Exploring and lifting the robustness of LLM-powered automated program repair with metamorphic testing.” arXiv, Mar. 09, 2025. doi: 10.48550/arXiv.2410.07516.</w:t>
       </w:r>
     </w:p>
     <w:p>
@@ -4179,7 +5499,7 @@
           <w:b w:val="0"/>
           <w:sz w:val="21"/>
         </w:rPr>
-        <w:t>[13] W. Chen et al., “AGENTVERSE: FACILITATING MULTI-AGENT COLLAB- ORATION AND EXPLORING EMERGENT BEHAVIORS,” 2024.</w:t>
+        <w:t>[13] X. Chen, M. Lin, N. Schärli, and D. Zhou, “Teaching large language models to self-debug.” arXiv, Oct. 05, 2023. doi: 10.48550/arXiv.2304.05128.</w:t>
       </w:r>
     </w:p>
     <w:p>
@@ -4194,7 +5514,7 @@
           <w:b w:val="0"/>
           <w:sz w:val="21"/>
         </w:rPr>
-        <w:t>[14] M. Cemri et al., “Why do multi-agent LLM systems fail?”</w:t>
+        <w:t>[14] J. He, C. Treude, and D. Lo, “LLM-based multi-agent systems for software engineering: Literature review, vision, and the road ahead,” ACM Trans. Softw. Eng. Methodol., vol. 34, no. 5, pp. 124:1–124:30, May 2025, doi: 10.1145/3712003.</w:t>
       </w:r>
     </w:p>
     <w:p>
@@ -4209,7 +5529,7 @@
           <w:b w:val="0"/>
           <w:sz w:val="21"/>
         </w:rPr>
-        <w:t>[15] K.-T. Tran, D. Dao, M.-D. Nguyen, Q.-V. Pham, B. O’Sullivan, and H. D. Nguyen, “Multi-agent collaboration mechanisms: A survey of LLMs.” arXiv, Jan. 10, 2025. doi: 10.48550/arXiv.2501.06322.</w:t>
+        <w:t>[15] S. Hong et al., “MetaGPT: Meta programming for a multi-agent collaborative framework.” arXiv, Nov. 01, 2024. doi: 10.48550/arXiv.2308.00352.</w:t>
       </w:r>
     </w:p>
     <w:p>
@@ -4224,7 +5544,7 @@
           <w:b w:val="0"/>
           <w:sz w:val="21"/>
         </w:rPr>
-        <w:t>[16] I. Bouzenia, P. Devanbu, and M. Pradel, “RepairAgent: An autonomous, LLM-based agent for program repair.” arXiv, Oct. 28, 2024. doi: 10.48550/arXiv.2403.17134.</w:t>
+        <w:t>[16] C. Qian et al., “ChatDev: Communicative agents for software development.” arXiv, Jun. 05, 2024. doi: 10.48550/arXiv.2307.07924.</w:t>
       </w:r>
     </w:p>
     <w:p>
@@ -4239,7 +5559,7 @@
           <w:b w:val="0"/>
           <w:sz w:val="21"/>
         </w:rPr>
-        <w:t>[17] D. Lin, J. Koppel, A. Chen, and A. Solar-Lezama, “QuixBugs: A multi-lingual program repair benchmark set based on the quixey challenge,” in Proceedings of the 2017 ACM SIGPLAN international symposium on new ideas, new paradigms, and reflections on programming and software, Vancouver, BC, Canada: ACM, 2017, pp. 55–64. doi: 10.1145/3133850.3133857.</w:t>
+        <w:t>[17] W. Chen et al., “AGENTVERSE: FACILITATING MULTI-AGENT COLLAB- ORATION AND EXPLORING EMERGENT BEHAVIORS,” 2024.</w:t>
       </w:r>
     </w:p>
     <w:p>
@@ -4254,7 +5574,7 @@
           <w:b w:val="0"/>
           <w:sz w:val="21"/>
         </w:rPr>
-        <w:t>[18] X. Li, S. Wang, S. Zeng, Y. Wu, and Y. Yang, “A survey on LLM-based multi-agent systems: Workflow, infrastructure, and challenges,” Vicinagearth, vol. 1, no. 1, p. 9, Oct. 2024, doi: 10.1007/s44336-024-00009-2.</w:t>
+        <w:t>[18] J. Guo et al., “A comprehensive survey on benchmarks and solutions in software engineering of LLM-empowered agentic system.” arXiv, Oct. 23, 2025. doi: 10.48550/arXiv.2510.09721.</w:t>
       </w:r>
     </w:p>
     <w:p>
@@ -4269,7 +5589,7 @@
           <w:b w:val="0"/>
           <w:sz w:val="21"/>
         </w:rPr>
-        <w:t>[19] N. Shinn, F. Cassano, E. Berman, A. Gopinath, K. Narasimhan, and S. Yao, “Reflexion: Language agents with verbal reinforcement learning.” arXiv, Oct. 10, 2023. doi: 10.48550/arXiv.2303.11366.</w:t>
+        <w:t>[19] M. Cemri et al., “Why do multi-agent LLM systems fail?”</w:t>
       </w:r>
     </w:p>
     <w:p>
@@ -4284,7 +5604,7 @@
           <w:b w:val="0"/>
           <w:sz w:val="21"/>
         </w:rPr>
-        <w:t>[20] K. Zuo, Y. Jiang, F. Mo, and P. Lio, “KG4Diagnosis: A hierarchical multi-agent LLM framework with knowledge graph enhancement for medical diagnosis,” in Proceedings of the first AAAI bridge program on AI for medicine and healthcare, PMLR, Apr. 2025, pp. 195–204. Accessed: May 27, 2026. [Online]. Available: https://proceedings.mlr.press/v281/zuo25a.html</w:t>
+        <w:t>[20] K.-T. Tran, D. Dao, M.-D. Nguyen, Q.-V. Pham, B. O’Sullivan, and H. D. Nguyen, “Multi-agent collaboration mechanisms: A survey of LLMs.” arXiv, Jan. 10, 2025. doi: 10.48550/arXiv.2501.06322.</w:t>
       </w:r>
     </w:p>
     <w:p>
@@ -4299,7 +5619,7 @@
           <w:b w:val="0"/>
           <w:sz w:val="21"/>
         </w:rPr>
-        <w:t>[21] A. Ghafarollahi and M. J. Buehler, “SciAgents: Automating scientific discovery through bioinspired multi-agent intelligent graph reasoning,” Advanced Materials, vol. 37, no. 22, p. 2413523, 2025, doi: 10.1002/adma.202413523.</w:t>
+        <w:t>[21] X. Li, S. Wang, S. Zeng, Y. Wu, and Y. Yang, “A survey on LLM-based multi-agent systems: Workflow, infrastructure, and challenges,” Vicinagearth, vol. 1, no. 1, p. 9, Oct. 2024, doi: 10.1007/s44336-024-00009-2.</w:t>
       </w:r>
     </w:p>
     <w:p>
@@ -4314,7 +5634,7 @@
           <w:b w:val="0"/>
           <w:sz w:val="21"/>
         </w:rPr>
-        <w:t>[22] R. Just, D. Jalali, and M. D. Ernst, “Defects4J: A database of existing faults to enable controlled testing studies for java programs,” in Proceedings of the 2014 international symposium on software testing and analysis, San Jose, CA, USA: ACM, 2014, pp. 437–440. doi: 10.1145/2610384.2628055.</w:t>
+        <w:t>[22] C. Qian et al., “SCALING LARGE LANGUAGE MODEL-BASED MULTI-AGENT COLLABORATION,” 2025.</w:t>
       </w:r>
     </w:p>
     <w:p>
@@ -4329,7 +5649,7 @@
           <w:b w:val="0"/>
           <w:sz w:val="21"/>
         </w:rPr>
-        <w:t>[23] J. Yang et al., “SWE-agent: Agent-computer interfaces enable automated software engineering.” arXiv, Nov. 11, 2024. doi: 10.48550/arXiv.2405.15793.</w:t>
+        <w:t>[23] Y. Hu et al., “SELF-EVOLVING MULTI-AGENT COLLABORATION NET- WORKS FOR SOFTWARE DEVELOPMENT,” 2025.</w:t>
       </w:r>
     </w:p>
     <w:p>
@@ -4359,7 +5679,67 @@
           <w:b w:val="0"/>
           <w:sz w:val="21"/>
         </w:rPr>
-        <w:t>[25] C. Qian et al., “SCALING LARGE LANGUAGE MODEL-BASED MULTI-AGENT COLLABORATION,” 2025.</w:t>
+        <w:t>[25] D. Lin, J. Koppel, A. Chen, and A. Solar-Lezama, “QuixBugs: A multi-lingual program repair benchmark set based on the quixey challenge,” in Proceedings of the 2017 ACM SIGPLAN international symposium on new ideas, new paradigms, and reflections on programming and software, Vancouver, BC, Canada: ACM, 2017, pp. 55–64. doi: 10.1145/3133850.3133857.</w:t>
+      </w:r>
+    </w:p>
+    <w:p>
+      <w:pPr>
+        <w:spacing w:line="300" w:lineRule="auto" w:after="80" w:before="0"/>
+        <w:ind w:firstLine="420"/>
+        <w:jc w:val="left"/>
+      </w:pPr>
+      <w:r>
+        <w:rPr>
+          <w:rFonts w:ascii="宋体" w:hAnsi="宋体" w:eastAsia="宋体"/>
+          <w:b w:val="0"/>
+          <w:sz w:val="21"/>
+        </w:rPr>
+        <w:t>[26] R. Just, D. Jalali, and M. D. Ernst, “Defects4J: A database of existing faults to enable controlled testing studies for java programs,” in Proceedings of the 2014 international symposium on software testing and analysis, San Jose, CA, USA: ACM, 2014, pp. 437–440. doi: 10.1145/2610384.2628055.</w:t>
+      </w:r>
+    </w:p>
+    <w:p>
+      <w:pPr>
+        <w:spacing w:line="300" w:lineRule="auto" w:after="80" w:before="0"/>
+        <w:ind w:firstLine="420"/>
+        <w:jc w:val="left"/>
+      </w:pPr>
+      <w:r>
+        <w:rPr>
+          <w:rFonts w:ascii="宋体" w:hAnsi="宋体" w:eastAsia="宋体"/>
+          <w:b w:val="0"/>
+          <w:sz w:val="21"/>
+        </w:rPr>
+        <w:t>[27] N. Shinn, F. Cassano, E. Berman, A. Gopinath, K. Narasimhan, and S. Yao, “Reflexion: Language agents with verbal reinforcement learning.” arXiv, Oct. 10, 2023. doi: 10.48550/arXiv.2303.11366.</w:t>
+      </w:r>
+    </w:p>
+    <w:p>
+      <w:pPr>
+        <w:spacing w:line="300" w:lineRule="auto" w:after="80" w:before="0"/>
+        <w:ind w:firstLine="420"/>
+        <w:jc w:val="left"/>
+      </w:pPr>
+      <w:r>
+        <w:rPr>
+          <w:rFonts w:ascii="宋体" w:hAnsi="宋体" w:eastAsia="宋体"/>
+          <w:b w:val="0"/>
+          <w:sz w:val="21"/>
+        </w:rPr>
+        <w:t>[28] K. Zuo, Y. Jiang, F. Mo, and P. Lio, “KG4Diagnosis: A hierarchical multi-agent LLM framework with knowledge graph enhancement for medical diagnosis,” in Proceedings of the first AAAI bridge program on AI for medicine and healthcare, PMLR, Apr. 2025, pp. 195–204. Accessed: May 27, 2026. [Online]. Available: https://proceedings.mlr.press/v281/zuo25a.html</w:t>
+      </w:r>
+    </w:p>
+    <w:p>
+      <w:pPr>
+        <w:spacing w:line="300" w:lineRule="auto" w:after="80" w:before="0"/>
+        <w:ind w:firstLine="420"/>
+        <w:jc w:val="left"/>
+      </w:pPr>
+      <w:r>
+        <w:rPr>
+          <w:rFonts w:ascii="宋体" w:hAnsi="宋体" w:eastAsia="宋体"/>
+          <w:b w:val="0"/>
+          <w:sz w:val="21"/>
+        </w:rPr>
+        <w:t>[29] A. Ghafarollahi and M. J. Buehler, “SciAgents: Automating scientific discovery through bioinspired multi-agent intelligent graph reasoning,” Advanced Materials, vol. 37, no. 22, p. 2413523, 2025, doi: 10.1002/adma.202413523.</w:t>
       </w:r>
     </w:p>
     <w:sectPr>

</xml_diff>